<commit_message>
Sync to Watchlog v3.10.1
Script, templates, README, quick start, notes, settings example, docs
(rebuilt overviews, IT summary, wording review, pending changes), docs
source, build and icon scripts. Personal email removed from notes.

Co-Authored-By: Claude Sonnet 5.5 <noreply@anthropic.com>
Claude-Session: https://claude.ai/code/session_013cAPknn24BxPEmaC7U3PaT
</commit_message>
<xml_diff>
--- a/docs/Watchlog - IT Summary.docx
+++ b/docs/Watchlog - IT Summary.docx
@@ -6,7 +6,6 @@
     <w:p>
       <w:pPr>
         <w:pStyle w:val="Heading1"/>
-        <w:spacing w:before="160" w:after="40"/>
       </w:pPr>
       <w:r>
         <w:t xml:space="preserve">Watchlog: information for IT</w:t>
@@ -15,57 +14,38 @@
     <w:p>
       <w:pPr>
         <w:pStyle w:val="FirstParagraph"/>
-        <w:spacing w:before="40" w:after="40"/>
-      </w:pPr>
-      <w:r>
-        <w:rPr>
-          <w:sz w:val="20"/>
-        </w:rPr>
-        <w:t xml:space="preserve">Oct 22, 2026 · Jakob</w:t>
+      </w:pPr>
+      <w:r>
+        <w:t xml:space="preserve">Oct 25, 2026 · Jakob</w:t>
       </w:r>
     </w:p>
     <w:p>
       <w:pPr>
         <w:pStyle w:val="BodyText"/>
-        <w:spacing w:before="40" w:after="40"/>
-      </w:pPr>
-      <w:r>
-        <w:rPr>
-          <w:sz w:val="20"/>
-        </w:rPr>
+      </w:pPr>
+      <w:r>
         <w:t xml:space="preserve">Watchlog is a small Windows program I built that types our standard surveillance log entries. I type a short code like</w:t>
       </w:r>
       <w:r>
-        <w:rPr>
-          <w:sz w:val="20"/>
-        </w:rPr>
         <w:t xml:space="preserve"> </w:t>
       </w:r>
       <w:r>
         <w:rPr>
           <w:rStyle w:val="VerbatimChar"/>
-          <w:sz w:val="20"/>
         </w:rPr>
         <w:t xml:space="preserve">;interior</w:t>
       </w:r>
       <w:r>
-        <w:rPr>
-          <w:sz w:val="20"/>
-        </w:rPr>
         <w:t xml:space="preserve"> </w:t>
       </w:r>
       <w:r>
-        <w:rPr>
-          <w:sz w:val="20"/>
-        </w:rPr>
-        <w:t xml:space="preserve">and the full wording appears. It runs on AutoHotkey v2, a free and widely used scripting tool, and the program is one plain text file anyone can read. I’ve been testing it myself since October 13. I’m asking for approval so other operators and supervisors can use it if they choose to. There is no pilot phase: it would be the 3 operator bays and the supervisor bay, for whoever wants it.</w:t>
+        <w:t xml:space="preserve">and the full wording appears. It’s written in AutoHotkey v2 and comes as one Watchlog.exe with the AutoHotkey runtime built in, so nothing else is installed. The same program is also available as one plain text script for anyone to read. I’m on version 3.9.5 and have been using it on my own shifts since October 13. I’m asking for approval so other operators and supervisors can use it if they choose to, on our 3 operator bays and the supervisor bay.</w:t>
       </w:r>
     </w:p>
     <w:bookmarkStart w:id="20" w:name="what-it-does-and-doesnt-do"/>
     <w:p>
       <w:pPr>
         <w:pStyle w:val="Heading2"/>
-        <w:spacing w:before="160" w:after="40"/>
       </w:pPr>
       <w:r>
         <w:t xml:space="preserve">What it does and doesn’t do</w:t>
@@ -78,12 +58,8 @@
           <w:numId w:val="1001"/>
         </w:numPr>
         <w:pStyle w:val="Compact"/>
-        <w:spacing w:before="40" w:after="40"/>
-      </w:pPr>
-      <w:r>
-        <w:rPr>
-          <w:sz w:val="20"/>
-        </w:rPr>
+      </w:pPr>
+      <w:r>
         <w:t xml:space="preserve">It types and pastes what the operator would have typed. The operator still saves the entry. It doesn’t change iTrak, SDS or any other system.</w:t>
       </w:r>
     </w:p>
@@ -94,13 +70,9 @@
           <w:numId w:val="1001"/>
         </w:numPr>
         <w:pStyle w:val="Compact"/>
-        <w:spacing w:before="40" w:after="40"/>
-      </w:pPr>
-      <w:r>
-        <w:rPr>
-          <w:sz w:val="20"/>
-        </w:rPr>
-        <w:t xml:space="preserve">It doesn’t connect to the internet or send anything anywhere. Its files only travel through OneDrive and SharePoint under our normal Microsoft 365 permissions.</w:t>
+      </w:pPr>
+      <w:r>
+        <w:t xml:space="preserve">It clears the Alert Grid list when the operator presses Caps Lock or Ctrl+Alt+A. It clicks the same steps as by hand (Ctrl+A, right-click, Acknowledge as received, Submit, OK) using screen positions taught once per PC. The Acknowledge box is filled in by Alert Grid with the operator’s own login. Watchlog never reads or types into it.</w:t>
       </w:r>
     </w:p>
     <w:p>
@@ -110,13 +82,9 @@
           <w:numId w:val="1001"/>
         </w:numPr>
         <w:pStyle w:val="Compact"/>
-        <w:spacing w:before="40" w:after="40"/>
-      </w:pPr>
-      <w:r>
-        <w:rPr>
-          <w:sz w:val="20"/>
-        </w:rPr>
-        <w:t xml:space="preserve">It doesn’t record what anyone types. It only watches for its own codes.</w:t>
+      </w:pPr>
+      <w:r>
+        <w:t xml:space="preserve">It doesn’t connect to the internet or send anything anywhere. Its files only travel through OneDrive and SharePoint under our normal Microsoft 365 permissions.</w:t>
       </w:r>
     </w:p>
     <w:p>
@@ -126,13 +94,9 @@
           <w:numId w:val="1001"/>
         </w:numPr>
         <w:pStyle w:val="Compact"/>
-        <w:spacing w:before="40" w:after="40"/>
-      </w:pPr>
-      <w:r>
-        <w:rPr>
-          <w:sz w:val="20"/>
-        </w:rPr>
-        <w:t xml:space="preserve">It needs no administrator rights. Everything it saves is in the user’s own folders and the user’s own part of the registry.</w:t>
+      </w:pPr>
+      <w:r>
+        <w:t xml:space="preserve">It doesn’t record what anyone types. It only watches for its own codes. It reads the clipboard only for a form box that takes a copy, and keeps a copied facial rec alert number or match % in memory for 2 minutes at most.</w:t>
       </w:r>
     </w:p>
     <w:bookmarkEnd w:id="20"/>
@@ -140,7 +104,6 @@
     <w:p>
       <w:pPr>
         <w:pStyle w:val="Heading2"/>
-        <w:spacing w:before="160" w:after="40"/>
       </w:pPr>
       <w:r>
         <w:t xml:space="preserve">Passwords and saved information</w:t>
@@ -153,13 +116,9 @@
           <w:numId w:val="1002"/>
         </w:numPr>
         <w:pStyle w:val="Compact"/>
-        <w:spacing w:before="40" w:after="40"/>
-      </w:pPr>
-      <w:r>
-        <w:rPr>
-          <w:sz w:val="20"/>
-        </w:rPr>
-        <w:t xml:space="preserve">Passwords are kept in Windows Credential Manager, on that PC, for that Windows user. They are never in a file, never synced and never shown. A password is only typed when that login’s code is typed.</w:t>
+      </w:pPr>
+      <w:r>
+        <w:t xml:space="preserve">Passwords are kept in Windows Credential Manager, on that PC, for that Windows user. They are never in a file, never synced and never shown.</w:t>
       </w:r>
     </w:p>
     <w:p>
@@ -169,13 +128,27 @@
           <w:numId w:val="1002"/>
         </w:numPr>
         <w:pStyle w:val="Compact"/>
-        <w:spacing w:before="40" w:after="40"/>
-      </w:pPr>
-      <w:r>
-        <w:rPr>
-          <w:sz w:val="20"/>
-        </w:rPr>
-        <w:t xml:space="preserve">The shift journal keeps the time, template name and text of each entry for 30 days, then deletes it. It can be set to counts only, or off.</w:t>
+      </w:pPr>
+      <w:r>
+        <w:t xml:space="preserve">A password is typed only when that login’s code is typed, or when the operator answers Yes to</w:t>
+      </w:r>
+      <w:r>
+        <w:t xml:space="preserve"> </w:t>
+      </w:r>
+      <w:r>
+        <w:t xml:space="preserve">“</w:t>
+      </w:r>
+      <w:r>
+        <w:t xml:space="preserve">Log in to SDS?</w:t>
+      </w:r>
+      <w:r>
+        <w:t xml:space="preserve">”</w:t>
+      </w:r>
+      <w:r>
+        <w:t xml:space="preserve"> </w:t>
+      </w:r>
+      <w:r>
+        <w:t xml:space="preserve">or to the start of shift sign-in. Each time it first checks that the window in front is one that login is locked to. Logins with no lock are never typed automatically.</w:t>
       </w:r>
     </w:p>
     <w:p>
@@ -185,13 +158,9 @@
           <w:numId w:val="1002"/>
         </w:numPr>
         <w:pStyle w:val="Compact"/>
-        <w:spacing w:before="40" w:after="40"/>
-      </w:pPr>
-      <w:r>
-        <w:rPr>
-          <w:sz w:val="20"/>
-        </w:rPr>
-        <w:t xml:space="preserve">The activity log stays on the PC and never holds passwords or log text. The registry holds only the last login time.</w:t>
+      </w:pPr>
+      <w:r>
+        <w:t xml:space="preserve">The shift journal keeps the time, template name and text of each entry for 30 days, then deletes it. It can be set to counts only, or off.</w:t>
       </w:r>
     </w:p>
     <w:p>
@@ -201,12 +170,20 @@
           <w:numId w:val="1002"/>
         </w:numPr>
         <w:pStyle w:val="Compact"/>
-        <w:spacing w:before="40" w:after="40"/>
-      </w:pPr>
-      <w:r>
-        <w:rPr>
-          <w:sz w:val="20"/>
-        </w:rPr>
+      </w:pPr>
+      <w:r>
+        <w:t xml:space="preserve">On the PC only: the activity log (never passwords or log text), Alert Grid click positions, window positions, time saved counts and a few last-used box values. The registry holds the last login time and the uninstall entry.</w:t>
+      </w:r>
+    </w:p>
+    <w:p>
+      <w:pPr>
+        <w:numPr>
+          <w:ilvl w:val="0"/>
+          <w:numId w:val="1002"/>
+        </w:numPr>
+        <w:pStyle w:val="Compact"/>
+      </w:pPr>
+      <w:r>
         <w:t xml:space="preserve">Tray menu &gt; Security and status shows all of this for the PC in front of you, with a Copy report button.</w:t>
       </w:r>
     </w:p>
@@ -215,7 +192,6 @@
     <w:p>
       <w:pPr>
         <w:pStyle w:val="Heading2"/>
-        <w:spacing w:before="160" w:after="40"/>
       </w:pPr>
       <w:r>
         <w:t xml:space="preserve">Updates and shared files</w:t>
@@ -224,43 +200,24 @@
     <w:p>
       <w:pPr>
         <w:pStyle w:val="FirstParagraph"/>
-        <w:spacing w:before="40" w:after="40"/>
-      </w:pPr>
-      <w:r>
-        <w:rPr>
-          <w:sz w:val="20"/>
-        </w:rPr>
-        <w:t xml:space="preserve">The approved wording is one file in a SharePoint folder that the supervisors look after. Each PC shows a short check code, so it’s easy to confirm every bay matches. A new version of the program can go in the same folder. Each PC asks</w:t>
-      </w:r>
-      <w:r>
-        <w:rPr>
-          <w:sz w:val="20"/>
-        </w:rPr>
+      </w:pPr>
+      <w:r>
+        <w:t xml:space="preserve">The approved wording is one file in a SharePoint folder that the supervisors look after. Each PC shows a short check code, so it’s easy to confirm every bay matches. A new Watchlog.exe can go in the same folder. Each PC asks</w:t>
+      </w:r>
+      <w:r>
         <w:t xml:space="preserve"> </w:t>
       </w:r>
       <w:r>
-        <w:rPr>
-          <w:sz w:val="20"/>
-        </w:rPr>
         <w:t xml:space="preserve">“</w:t>
       </w:r>
       <w:r>
-        <w:rPr>
-          <w:sz w:val="20"/>
-        </w:rPr>
         <w:t xml:space="preserve">Update now?</w:t>
       </w:r>
       <w:r>
-        <w:rPr>
-          <w:sz w:val="20"/>
-        </w:rPr>
         <w:t xml:space="preserve">”</w:t>
       </w:r>
       <w:r>
-        <w:rPr>
-          <w:sz w:val="20"/>
-        </w:rPr>
-        <w:t xml:space="preserve">, checks that the file loads, keeps a backup and refuses a broken file. That means whoever can edit the folder controls what the bays run, so I’d ask that edit access be limited to the supervisors and me.</w:t>
+        <w:t xml:space="preserve">, checks the file, keeps a backup and refuses a broken one. That means whoever can edit the folder controls what the bays run, so I’d ask that edit access be limited to the supervisors and me. A user can also point their own PC at a folder of their own for testing, which only affects that PC.</w:t>
       </w:r>
     </w:p>
     <w:bookmarkEnd w:id="22"/>
@@ -268,7 +225,6 @@
     <w:p>
       <w:pPr>
         <w:pStyle w:val="Heading2"/>
-        <w:spacing w:before="160" w:after="40"/>
       </w:pPr>
       <w:r>
         <w:t xml:space="preserve">What I’m asking IT to approve</w:t>
@@ -281,13 +237,9 @@
           <w:numId w:val="1003"/>
         </w:numPr>
         <w:pStyle w:val="Compact"/>
-        <w:spacing w:before="40" w:after="40"/>
-      </w:pPr>
-      <w:r>
-        <w:rPr>
-          <w:sz w:val="20"/>
-        </w:rPr>
-        <w:t xml:space="preserve">AutoHotkey v2 on the 4 PCs (or I can build a single Watchlog.exe if you’d rather).</w:t>
+      </w:pPr>
+      <w:r>
+        <w:t xml:space="preserve">Watchlog.exe installed per user, with no admin rights, and starting with Windows. It isn’t signed, so SmartScreen may warn once.</w:t>
       </w:r>
     </w:p>
     <w:p>
@@ -297,13 +249,9 @@
           <w:numId w:val="1003"/>
         </w:numPr>
         <w:pStyle w:val="Compact"/>
-        <w:spacing w:before="40" w:after="40"/>
-      </w:pPr>
-      <w:r>
-        <w:rPr>
-          <w:sz w:val="20"/>
-        </w:rPr>
-        <w:t xml:space="preserve">Passwords in Windows Credential Manager, typed on request.</w:t>
+      </w:pPr>
+      <w:r>
+        <w:t xml:space="preserve">Passwords in Windows Credential Manager, typed into the programs they’re locked to.</w:t>
       </w:r>
     </w:p>
     <w:p>
@@ -313,13 +261,9 @@
           <w:numId w:val="1003"/>
         </w:numPr>
         <w:pStyle w:val="Compact"/>
-        <w:spacing w:before="40" w:after="40"/>
-      </w:pPr>
-      <w:r>
-        <w:rPr>
-          <w:sz w:val="20"/>
-        </w:rPr>
-        <w:t xml:space="preserve">Watchlog starting with Windows.</w:t>
+      </w:pPr>
+      <w:r>
+        <w:t xml:space="preserve">Watchlog clicking through the Alert Grid acknowledge steps for the operator.</w:t>
       </w:r>
     </w:p>
     <w:p>
@@ -329,12 +273,8 @@
           <w:numId w:val="1003"/>
         </w:numPr>
         <w:pStyle w:val="Compact"/>
-        <w:spacing w:before="40" w:after="40"/>
-      </w:pPr>
-      <w:r>
-        <w:rPr>
-          <w:sz w:val="20"/>
-        </w:rPr>
+      </w:pPr>
+      <w:r>
         <w:t xml:space="preserve">The 30 day shift journal (or counts only).</w:t>
       </w:r>
     </w:p>
@@ -345,12 +285,8 @@
           <w:numId w:val="1003"/>
         </w:numPr>
         <w:pStyle w:val="Compact"/>
-        <w:spacing w:before="40" w:after="40"/>
-      </w:pPr>
-      <w:r>
-        <w:rPr>
-          <w:sz w:val="20"/>
-        </w:rPr>
+      </w:pPr>
+      <w:r>
         <w:t xml:space="preserve">Edit access to the SharePoint template folder.</w:t>
       </w:r>
     </w:p>
@@ -359,7 +295,6 @@
     <w:p>
       <w:pPr>
         <w:pStyle w:val="Heading2"/>
-        <w:spacing w:before="160" w:after="40"/>
       </w:pPr>
       <w:r>
         <w:t xml:space="preserve">Setting up and removing it</w:t>
@@ -368,88 +303,84 @@
     <w:p>
       <w:pPr>
         <w:pStyle w:val="FirstParagraph"/>
-        <w:spacing w:before="40" w:after="40"/>
-      </w:pPr>
-      <w:r>
-        <w:rPr>
-          <w:sz w:val="20"/>
-        </w:rPr>
-        <w:t xml:space="preserve">Setup per PC: install AutoHotkey, make sure OneDrive starts with Windows and the Watchlog folder is set to Always keep on this device, open Watchlog and fill in the welcome window, tick Start with Windows, then check Security and status.</w:t>
-      </w:r>
-    </w:p>
-    <w:p>
-      <w:pPr>
-        <w:pStyle w:val="BodyText"/>
-        <w:spacing w:before="40" w:after="40"/>
-      </w:pPr>
-      <w:r>
-        <w:rPr>
-          <w:sz w:val="20"/>
-        </w:rPr>
-        <w:t xml:space="preserve">To remove it, choose Exit from the tray icon, remove each login in Settings (which deletes its saved password), then delete the Startup shortcut, the Watchlog folder,</w:t>
-      </w:r>
-      <w:r>
-        <w:rPr>
-          <w:sz w:val="20"/>
-        </w:rPr>
+      </w:pPr>
+      <w:r>
+        <w:t xml:space="preserve">Setup per PC: run Watchlog.exe and say yes to installing (it goes in</w:t>
+      </w:r>
+      <w:r>
         <w:t xml:space="preserve"> </w:t>
       </w:r>
       <w:r>
         <w:rPr>
           <w:rStyle w:val="VerbatimChar"/>
-          <w:sz w:val="20"/>
+        </w:rPr>
+        <w:t xml:space="preserve">%LOCALAPPDATA%\Programs\Watchlog</w:t>
+      </w:r>
+      <w:r>
+        <w:t xml:space="preserve">, with a Start menu entry and a Startup shortcut), go through the welcome window, then teach the Alert Grid clicks once with Ctrl+Alt+Shift+A. Settings live in</w:t>
+      </w:r>
+      <w:r>
+        <w:t xml:space="preserve"> </w:t>
+      </w:r>
+      <w:r>
+        <w:rPr>
+          <w:rStyle w:val="VerbatimChar"/>
+        </w:rPr>
+        <w:t xml:space="preserve">Documents\Watchlog</w:t>
+      </w:r>
+      <w:r>
+        <w:t xml:space="preserve">, so OneDrive needs to start with Windows.</w:t>
+      </w:r>
+    </w:p>
+    <w:p>
+      <w:pPr>
+        <w:pStyle w:val="BodyText"/>
+      </w:pPr>
+      <w:r>
+        <w:t xml:space="preserve">To remove it, use Settings &gt; Apps &gt; Watchlog. It offers to delete the saved passwords and leaves the operator’s settings and journal in Documents.</w:t>
+      </w:r>
+      <w:r>
+        <w:t xml:space="preserve"> </w:t>
+      </w:r>
+      <w:r>
+        <w:rPr>
+          <w:rStyle w:val="VerbatimChar"/>
         </w:rPr>
         <w:t xml:space="preserve">%LOCALAPPDATA%\Watchlog</w:t>
       </w:r>
       <w:r>
-        <w:rPr>
-          <w:sz w:val="20"/>
-        </w:rPr>
         <w:t xml:space="preserve"> </w:t>
       </w:r>
       <w:r>
-        <w:rPr>
-          <w:sz w:val="20"/>
-        </w:rPr>
         <w:t xml:space="preserve">and</w:t>
       </w:r>
       <w:r>
-        <w:rPr>
-          <w:sz w:val="20"/>
-        </w:rPr>
         <w:t xml:space="preserve"> </w:t>
       </w:r>
       <w:r>
         <w:rPr>
           <w:rStyle w:val="VerbatimChar"/>
-          <w:sz w:val="20"/>
         </w:rPr>
         <w:t xml:space="preserve">HKCU\Software\Watchlog</w:t>
       </w:r>
       <w:r>
-        <w:rPr>
-          <w:sz w:val="20"/>
-        </w:rPr>
-        <w:t xml:space="preserve">.</w:t>
+        <w:t xml:space="preserve"> </w:t>
+      </w:r>
+      <w:r>
+        <w:t xml:space="preserve">can then be deleted.</w:t>
       </w:r>
     </w:p>
     <w:p>
       <w:pPr>
         <w:pStyle w:val="BodyText"/>
-        <w:spacing w:before="40" w:after="40"/>
-      </w:pPr>
-      <w:r>
-        <w:rPr>
-          <w:sz w:val="20"/>
-        </w:rPr>
+      </w:pPr>
+      <w:r>
         <w:t xml:space="preserve">I’m happy to show it working to anyone who’d like to see it. The full overview has more detail.</w:t>
       </w:r>
     </w:p>
     <w:bookmarkEnd w:id="24"/>
     <w:bookmarkEnd w:id="25"/>
-    <w:sectPr>
-      <w:pgMar w:left="1152" w:right="1152" w:top="864" w:bottom="864"/>
-    </w:sectPr>
+    <w:sectPr/>
   </w:body>
 </w:document>
 </file>
@@ -779,6 +710,10 @@
   <w:style w:default="1" w:styleId="Normal" w:type="paragraph">
     <w:name w:val="Normal"/>
     <w:qFormat/>
+    <w:rPr>
+      <w:rFonts w:ascii="Calibri" w:hAnsi="Calibri"/>
+      <w:sz w:val="22"/>
+    </w:rPr>
   </w:style>
   <w:style w:styleId="BodyText" w:type="paragraph">
     <w:name w:val="Body Text"/>
@@ -788,12 +723,20 @@
       <w:spacing w:after="180" w:before="180"/>
     </w:pPr>
     <w:qFormat/>
+    <w:rPr>
+      <w:rFonts w:ascii="Calibri" w:hAnsi="Calibri"/>
+      <w:sz w:val="22"/>
+    </w:rPr>
   </w:style>
   <w:style w:customStyle="1" w:styleId="FirstParagraph" w:type="paragraph">
     <w:name w:val="First Paragraph"/>
     <w:basedOn w:val="BodyText"/>
     <w:next w:val="BodyText"/>
     <w:qFormat/>
+    <w:rPr>
+      <w:rFonts w:ascii="Calibri" w:hAnsi="Calibri"/>
+      <w:sz w:val="22"/>
+    </w:rPr>
   </w:style>
   <w:style w:customStyle="1" w:styleId="Compact" w:type="paragraph">
     <w:name w:val="Compact"/>
@@ -802,6 +745,10 @@
     <w:pPr>
       <w:spacing w:after="36" w:before="36"/>
     </w:pPr>
+    <w:rPr>
+      <w:rFonts w:ascii="Calibri" w:hAnsi="Calibri"/>
+      <w:sz w:val="21"/>
+    </w:rPr>
   </w:style>
   <w:style w:styleId="Title" w:type="paragraph">
     <w:name w:val="Title"/>
@@ -815,11 +762,11 @@
       <w:jc w:val="center"/>
     </w:pPr>
     <w:rPr>
-      <w:rFonts w:asciiTheme="majorHAnsi" w:cstheme="majorBidi" w:eastAsiaTheme="majorEastAsia" w:hAnsiTheme="majorHAnsi"/>
+      <w:rFonts w:ascii="Calibri" w:asciiTheme="majorHAnsi" w:cstheme="majorBidi" w:eastAsiaTheme="majorEastAsia" w:hAnsi="Calibri" w:hAnsiTheme="majorHAnsi"/>
       <w:b/>
       <w:bCs/>
-      <w:color w:themeColor="accent1" w:themeShade="B5" w:val="345A8A"/>
-      <w:sz w:val="36"/>
+      <w:color w:val="1F5F5F"/>
+      <w:sz w:val="44"/>
       <w:szCs w:val="36"/>
     </w:rPr>
   </w:style>
@@ -835,6 +782,7 @@
       <w:jc w:val="center"/>
     </w:pPr>
     <w:rPr>
+      <w:rFonts w:ascii="Calibri" w:hAnsi="Calibri"/>
       <w:sz w:val="30"/>
       <w:szCs w:val="30"/>
     </w:rPr>
@@ -848,6 +796,9 @@
       <w:keepLines/>
       <w:jc w:val="center"/>
     </w:pPr>
+    <w:rPr>
+      <w:rFonts w:ascii="Calibri" w:hAnsi="Calibri"/>
+    </w:rPr>
   </w:style>
   <w:style w:styleId="Date" w:type="paragraph">
     <w:name w:val="Date"/>
@@ -858,6 +809,9 @@
       <w:keepLines/>
       <w:jc w:val="center"/>
     </w:pPr>
+    <w:rPr>
+      <w:rFonts w:ascii="Calibri" w:hAnsi="Calibri"/>
+    </w:rPr>
   </w:style>
   <w:style w:customStyle="1" w:styleId="AbstractTitle" w:type="paragraph">
     <w:name w:val="Abstract Title"/>
@@ -873,6 +827,7 @@
     <w:rPr>
       <w:sz w:val="20"/>
       <w:szCs w:val="20"/>
+      <w:rFonts w:ascii="Calibri" w:hAnsi="Calibri"/>
       <w:b/>
       <w:color w:val="345A8A"/>
       &gt;
@@ -889,6 +844,7 @@
       <w:spacing w:after="300" w:before="100"/>
     </w:pPr>
     <w:rPr>
+      <w:rFonts w:ascii="Calibri" w:hAnsi="Calibri"/>
       <w:sz w:val="20"/>
       <w:szCs w:val="20"/>
     </w:rPr>
@@ -899,7 +855,9 @@
     <w:next w:val="Bibliography"/>
     <w:qFormat/>
     <w:pPr/>
-    <w:rPr/>
+    <w:rPr>
+      <w:rFonts w:ascii="Calibri" w:hAnsi="Calibri"/>
+    </w:rPr>
   </w:style>
   <w:style w:styleId="Heading1" w:type="paragraph">
     <w:name w:val="Heading 1"/>
@@ -914,7 +872,7 @@
       <w:outlineLvl w:val="0"/>
     </w:pPr>
     <w:rPr>
-      <w:rFonts w:asciiTheme="majorHAnsi" w:cstheme="majorBidi" w:eastAsiaTheme="majorEastAsia" w:hAnsiTheme="majorHAnsi"/>
+      <w:rFonts w:ascii="Calibri" w:asciiTheme="majorHAnsi" w:cstheme="majorBidi" w:eastAsiaTheme="majorEastAsia" w:hAnsi="Calibri" w:hAnsiTheme="majorHAnsi"/>
       <w:b/>
       <w:bCs/>
       <w:color w:themeColor="accent1" w:val="4F81BD"/>
@@ -936,7 +894,7 @@
       <w:outlineLvl w:val="1"/>
     </w:pPr>
     <w:rPr>
-      <w:rFonts w:asciiTheme="majorHAnsi" w:cstheme="majorBidi" w:eastAsiaTheme="majorEastAsia" w:hAnsiTheme="majorHAnsi"/>
+      <w:rFonts w:ascii="Calibri" w:asciiTheme="majorHAnsi" w:cstheme="majorBidi" w:eastAsiaTheme="majorEastAsia" w:hAnsi="Calibri" w:hAnsiTheme="majorHAnsi"/>
       <w:b/>
       <w:bCs/>
       <w:color w:themeColor="accent1" w:val="4F81BD"/>
@@ -958,7 +916,7 @@
       <w:outlineLvl w:val="2"/>
     </w:pPr>
     <w:rPr>
-      <w:rFonts w:asciiTheme="majorHAnsi" w:cstheme="majorBidi" w:eastAsiaTheme="majorEastAsia" w:hAnsiTheme="majorHAnsi"/>
+      <w:rFonts w:ascii="Calibri" w:asciiTheme="majorHAnsi" w:cstheme="majorBidi" w:eastAsiaTheme="majorEastAsia" w:hAnsi="Calibri" w:hAnsiTheme="majorHAnsi"/>
       <w:b/>
       <w:bCs/>
       <w:color w:themeColor="accent1" w:val="4F81BD"/>
@@ -980,7 +938,7 @@
       <w:outlineLvl w:val="3"/>
     </w:pPr>
     <w:rPr>
-      <w:rFonts w:asciiTheme="majorHAnsi" w:cstheme="majorBidi" w:eastAsiaTheme="majorEastAsia" w:hAnsiTheme="majorHAnsi"/>
+      <w:rFonts w:ascii="Calibri" w:asciiTheme="majorHAnsi" w:cstheme="majorBidi" w:eastAsiaTheme="majorEastAsia" w:hAnsi="Calibri" w:hAnsiTheme="majorHAnsi"/>
       <w:i/>
       <w:bCs/>
       <w:color w:themeColor="accent1" w:val="4F81BD"/>
@@ -1002,7 +960,7 @@
       <w:outlineLvl w:val="4"/>
     </w:pPr>
     <w:rPr>
-      <w:rFonts w:asciiTheme="majorHAnsi" w:cstheme="majorBidi" w:eastAsiaTheme="majorEastAsia" w:hAnsiTheme="majorHAnsi"/>
+      <w:rFonts w:ascii="Calibri" w:asciiTheme="majorHAnsi" w:cstheme="majorBidi" w:eastAsiaTheme="majorEastAsia" w:hAnsi="Calibri" w:hAnsiTheme="majorHAnsi"/>
       <w:iCs/>
       <w:color w:themeColor="accent1" w:val="4F81BD"/>
       <w:sz w:val="24"/>
@@ -1023,7 +981,7 @@
       <w:outlineLvl w:val="5"/>
     </w:pPr>
     <w:rPr>
-      <w:rFonts w:asciiTheme="majorHAnsi" w:cstheme="majorBidi" w:eastAsiaTheme="majorEastAsia" w:hAnsiTheme="majorHAnsi"/>
+      <w:rFonts w:ascii="Calibri" w:asciiTheme="majorHAnsi" w:cstheme="majorBidi" w:eastAsiaTheme="majorEastAsia" w:hAnsi="Calibri" w:hAnsiTheme="majorHAnsi"/>
       <w:color w:themeColor="accent1" w:val="4F81BD"/>
       <w:sz w:val="24"/>
       <w:szCs w:val="24"/>
@@ -1043,7 +1001,7 @@
       <w:outlineLvl w:val="6"/>
     </w:pPr>
     <w:rPr>
-      <w:rFonts w:asciiTheme="majorHAnsi" w:cstheme="majorBidi" w:eastAsiaTheme="majorEastAsia" w:hAnsiTheme="majorHAnsi"/>
+      <w:rFonts w:ascii="Calibri" w:asciiTheme="majorHAnsi" w:cstheme="majorBidi" w:eastAsiaTheme="majorEastAsia" w:hAnsi="Calibri" w:hAnsiTheme="majorHAnsi"/>
       <w:color w:themeColor="accent1" w:val="4F81BD"/>
       <w:sz w:val="24"/>
       <w:szCs w:val="24"/>
@@ -1063,7 +1021,7 @@
       <w:outlineLvl w:val="7"/>
     </w:pPr>
     <w:rPr>
-      <w:rFonts w:asciiTheme="majorHAnsi" w:cstheme="majorBidi" w:eastAsiaTheme="majorEastAsia" w:hAnsiTheme="majorHAnsi"/>
+      <w:rFonts w:ascii="Calibri" w:asciiTheme="majorHAnsi" w:cstheme="majorBidi" w:eastAsiaTheme="majorEastAsia" w:hAnsi="Calibri" w:hAnsiTheme="majorHAnsi"/>
       <w:color w:themeColor="accent1" w:val="4F81BD"/>
       <w:sz w:val="24"/>
       <w:szCs w:val="24"/>
@@ -1083,7 +1041,7 @@
       <w:outlineLvl w:val="8"/>
     </w:pPr>
     <w:rPr>
-      <w:rFonts w:asciiTheme="majorHAnsi" w:cstheme="majorBidi" w:eastAsiaTheme="majorEastAsia" w:hAnsiTheme="majorHAnsi"/>
+      <w:rFonts w:ascii="Calibri" w:asciiTheme="majorHAnsi" w:cstheme="majorBidi" w:eastAsiaTheme="majorEastAsia" w:hAnsi="Calibri" w:hAnsiTheme="majorHAnsi"/>
       <w:color w:themeColor="accent1" w:val="4F81BD"/>
       <w:sz w:val="24"/>
       <w:szCs w:val="24"/>
@@ -1100,6 +1058,9 @@
       <w:spacing w:after="100" w:before="100"/>
       <w:ind w:firstLine="0" w:left="480" w:right="480"/>
     </w:pPr>
+    <w:rPr>
+      <w:rFonts w:ascii="Calibri" w:hAnsi="Calibri"/>
+    </w:rPr>
   </w:style>
   <w:style w:styleId="FootnoteText" w:type="paragraph">
     <w:name w:val="Footnote Text"/>
@@ -1108,11 +1069,17 @@
     <w:uiPriority w:val="9"/>
     <w:unhideWhenUsed/>
     <w:qFormat/>
+    <w:rPr>
+      <w:rFonts w:ascii="Calibri" w:hAnsi="Calibri"/>
+    </w:rPr>
   </w:style>
   <w:style w:default="1" w:styleId="DefaultParagraphFont" w:type="character">
     <w:name w:val="Default Paragraph Font"/>
     <w:semiHidden/>
     <w:unhideWhenUsed/>
+    <w:rPr>
+      <w:rFonts w:ascii="Calibri" w:hAnsi="Calibri"/>
+    </w:rPr>
   </w:style>
   <w:style w:default="1" w:styleId="Table" w:type="table">
     <w:name w:val="Table"/>
@@ -1120,6 +1087,9 @@
     <w:semiHidden/>
     <w:unhideWhenUsed/>
     <w:qFormat/>
+    <w:rPr>
+      <w:rFonts w:ascii="Calibri" w:hAnsi="Calibri"/>
+    </w:rPr>
     <w:tblPr>
       <w:tblInd w:type="dxa" w:w="0"/>
       <w:tblCellMar>
@@ -1155,12 +1125,16 @@
       <w:spacing w:after="0"/>
     </w:pPr>
     <w:rPr>
+      <w:rFonts w:ascii="Calibri" w:hAnsi="Calibri"/>
       <w:b/>
     </w:rPr>
   </w:style>
   <w:style w:customStyle="1" w:styleId="Definition" w:type="paragraph">
     <w:name w:val="Definition"/>
     <w:basedOn w:val="Normal"/>
+    <w:rPr>
+      <w:rFonts w:ascii="Calibri" w:hAnsi="Calibri"/>
+    </w:rPr>
   </w:style>
   <w:style w:styleId="Caption" w:type="paragraph">
     <w:name w:val="Caption"/>
@@ -1170,6 +1144,7 @@
       <w:spacing w:after="120" w:before="0"/>
     </w:pPr>
     <w:rPr>
+      <w:rFonts w:ascii="Calibri" w:hAnsi="Calibri"/>
       <w:i/>
     </w:rPr>
   </w:style>
@@ -1179,14 +1154,23 @@
     <w:pPr>
       <w:keepNext/>
     </w:pPr>
+    <w:rPr>
+      <w:rFonts w:ascii="Calibri" w:hAnsi="Calibri"/>
+    </w:rPr>
   </w:style>
   <w:style w:customStyle="1" w:styleId="ImageCaption" w:type="paragraph">
     <w:name w:val="Image Caption"/>
     <w:basedOn w:val="Caption"/>
+    <w:rPr>
+      <w:rFonts w:ascii="Calibri" w:hAnsi="Calibri"/>
+    </w:rPr>
   </w:style>
   <w:style w:customStyle="1" w:styleId="Figure" w:type="paragraph">
     <w:name w:val="Figure"/>
     <w:basedOn w:val="Normal"/>
+    <w:rPr>
+      <w:rFonts w:ascii="Calibri" w:hAnsi="Calibri"/>
+    </w:rPr>
   </w:style>
   <w:style w:customStyle="1" w:styleId="CaptionedFigure" w:type="paragraph">
     <w:name w:val="Captioned Figure"/>
@@ -1194,28 +1178,38 @@
     <w:pPr>
       <w:keepNext/>
     </w:pPr>
+    <w:rPr>
+      <w:rFonts w:ascii="Calibri" w:hAnsi="Calibri"/>
+    </w:rPr>
   </w:style>
   <w:style w:customStyle="1" w:styleId="BodyTextChar" w:type="character">
     <w:name w:val="Body Text Char"/>
     <w:basedOn w:val="DefaultParagraphFont"/>
     <w:link w:val="BodyText"/>
+    <w:rPr>
+      <w:rFonts w:ascii="Calibri" w:hAnsi="Calibri"/>
+    </w:rPr>
   </w:style>
   <w:style w:customStyle="1" w:styleId="VerbatimChar" w:type="character">
     <w:name w:val="Verbatim Char"/>
     <w:basedOn w:val="BodyTextChar"/>
     <w:rPr>
-      <w:rFonts w:ascii="Consolas" w:hAnsi="Consolas"/>
+      <w:rFonts w:ascii="Calibri" w:hAnsi="Calibri"/>
       <w:sz w:val="22"/>
     </w:rPr>
   </w:style>
   <w:style w:customStyle="1" w:styleId="SectionNumber" w:type="character">
     <w:name w:val="Section Number"/>
     <w:basedOn w:val="BodyTextChar"/>
+    <w:rPr>
+      <w:rFonts w:ascii="Calibri" w:hAnsi="Calibri"/>
+    </w:rPr>
   </w:style>
   <w:style w:styleId="FootnoteReference" w:type="character">
     <w:name w:val="Footnote Reference"/>
     <w:basedOn w:val="BodyTextChar"/>
     <w:rPr>
+      <w:rFonts w:ascii="Calibri" w:hAnsi="Calibri"/>
       <w:vertAlign w:val="superscript"/>
     </w:rPr>
   </w:style>
@@ -1223,6 +1217,7 @@
     <w:name w:val="Hyperlink"/>
     <w:basedOn w:val="BodyTextChar"/>
     <w:rPr>
+      <w:rFonts w:ascii="Calibri" w:hAnsi="Calibri"/>
       <w:color w:themeColor="accent1" w:val="4F81BD"/>
     </w:rPr>
   </w:style>
@@ -1238,13 +1233,13 @@
       <w:outlineLvl w:val="9"/>
     </w:pPr>
     <w:rPr>
-      <w:rFonts w:asciiTheme="majorHAnsi" w:cstheme="majorBidi" w:eastAsiaTheme="majorEastAsia" w:hAnsiTheme="majorHAnsi"/>
+      <w:rFonts w:ascii="Calibri" w:asciiTheme="majorHAnsi" w:cstheme="majorBidi" w:eastAsiaTheme="majorEastAsia" w:hAnsi="Calibri" w:hAnsiTheme="majorHAnsi"/>
       <w:b w:val="0"/>
       <w:bCs w:val="0"/>
       <w:color w:themeColor="accent1" w:themeShade="BF" w:val="365F91"/>
     </w:rPr>
   </w:style>
-  <w:style w:customStyle="1" w:styleId="SourceCode" w:type="paragraph">
+  <w:style w:type="paragraph" w:customStyle="1" w:styleId="SourceCode">
     <w:name w:val="Source Code"/>
     <w:basedOn w:val="Normal"/>
     <w:link w:val="VerbatimChar"/>
@@ -1252,7 +1247,7 @@
       <w:wordWrap w:val="off"/>
     </w:pPr>
   </w:style>
-  <w:style w:customStyle="1" w:styleId="KeywordTok" w:type="character">
+  <w:style w:type="character" w:customStyle="1" w:styleId="KeywordTok">
     <w:name w:val="KeywordTok"/>
     <w:basedOn w:val="VerbatimChar"/>
     <w:rPr>
@@ -1260,77 +1255,77 @@
       <w:b/>
     </w:rPr>
   </w:style>
-  <w:style w:customStyle="1" w:styleId="DataTypeTok" w:type="character">
+  <w:style w:type="character" w:customStyle="1" w:styleId="DataTypeTok">
     <w:name w:val="DataTypeTok"/>
     <w:basedOn w:val="VerbatimChar"/>
     <w:rPr>
       <w:color w:val="902000"/>
     </w:rPr>
   </w:style>
-  <w:style w:customStyle="1" w:styleId="DecValTok" w:type="character">
+  <w:style w:type="character" w:customStyle="1" w:styleId="DecValTok">
     <w:name w:val="DecValTok"/>
     <w:basedOn w:val="VerbatimChar"/>
     <w:rPr>
       <w:color w:val="40a070"/>
     </w:rPr>
   </w:style>
-  <w:style w:customStyle="1" w:styleId="BaseNTok" w:type="character">
+  <w:style w:type="character" w:customStyle="1" w:styleId="BaseNTok">
     <w:name w:val="BaseNTok"/>
     <w:basedOn w:val="VerbatimChar"/>
     <w:rPr>
       <w:color w:val="40a070"/>
     </w:rPr>
   </w:style>
-  <w:style w:customStyle="1" w:styleId="FloatTok" w:type="character">
+  <w:style w:type="character" w:customStyle="1" w:styleId="FloatTok">
     <w:name w:val="FloatTok"/>
     <w:basedOn w:val="VerbatimChar"/>
     <w:rPr>
       <w:color w:val="40a070"/>
     </w:rPr>
   </w:style>
-  <w:style w:customStyle="1" w:styleId="ConstantTok" w:type="character">
+  <w:style w:type="character" w:customStyle="1" w:styleId="ConstantTok">
     <w:name w:val="ConstantTok"/>
     <w:basedOn w:val="VerbatimChar"/>
     <w:rPr>
       <w:color w:val="880000"/>
     </w:rPr>
   </w:style>
-  <w:style w:customStyle="1" w:styleId="CharTok" w:type="character">
+  <w:style w:type="character" w:customStyle="1" w:styleId="CharTok">
     <w:name w:val="CharTok"/>
     <w:basedOn w:val="VerbatimChar"/>
     <w:rPr>
       <w:color w:val="4070a0"/>
     </w:rPr>
   </w:style>
-  <w:style w:customStyle="1" w:styleId="SpecialCharTok" w:type="character">
+  <w:style w:type="character" w:customStyle="1" w:styleId="SpecialCharTok">
     <w:name w:val="SpecialCharTok"/>
     <w:basedOn w:val="VerbatimChar"/>
     <w:rPr>
       <w:color w:val="4070a0"/>
     </w:rPr>
   </w:style>
-  <w:style w:customStyle="1" w:styleId="StringTok" w:type="character">
+  <w:style w:type="character" w:customStyle="1" w:styleId="StringTok">
     <w:name w:val="StringTok"/>
     <w:basedOn w:val="VerbatimChar"/>
     <w:rPr>
       <w:color w:val="4070a0"/>
     </w:rPr>
   </w:style>
-  <w:style w:customStyle="1" w:styleId="VerbatimStringTok" w:type="character">
+  <w:style w:type="character" w:customStyle="1" w:styleId="VerbatimStringTok">
     <w:name w:val="VerbatimStringTok"/>
     <w:basedOn w:val="VerbatimChar"/>
     <w:rPr>
       <w:color w:val="4070a0"/>
     </w:rPr>
   </w:style>
-  <w:style w:customStyle="1" w:styleId="SpecialStringTok" w:type="character">
+  <w:style w:type="character" w:customStyle="1" w:styleId="SpecialStringTok">
     <w:name w:val="SpecialStringTok"/>
     <w:basedOn w:val="VerbatimChar"/>
     <w:rPr>
       <w:color w:val="bb6688"/>
     </w:rPr>
   </w:style>
-  <w:style w:customStyle="1" w:styleId="ImportTok" w:type="character">
+  <w:style w:type="character" w:customStyle="1" w:styleId="ImportTok">
     <w:name w:val="ImportTok"/>
     <w:basedOn w:val="VerbatimChar"/>
     <w:rPr>
@@ -1338,7 +1333,7 @@
       <w:b/>
     </w:rPr>
   </w:style>
-  <w:style w:customStyle="1" w:styleId="CommentTok" w:type="character">
+  <w:style w:type="character" w:customStyle="1" w:styleId="CommentTok">
     <w:name w:val="CommentTok"/>
     <w:basedOn w:val="VerbatimChar"/>
     <w:rPr>
@@ -1346,7 +1341,7 @@
       <w:i/>
     </w:rPr>
   </w:style>
-  <w:style w:customStyle="1" w:styleId="DocumentationTok" w:type="character">
+  <w:style w:type="character" w:customStyle="1" w:styleId="DocumentationTok">
     <w:name w:val="DocumentationTok"/>
     <w:basedOn w:val="VerbatimChar"/>
     <w:rPr>
@@ -1354,7 +1349,7 @@
       <w:i/>
     </w:rPr>
   </w:style>
-  <w:style w:customStyle="1" w:styleId="AnnotationTok" w:type="character">
+  <w:style w:type="character" w:customStyle="1" w:styleId="AnnotationTok">
     <w:name w:val="AnnotationTok"/>
     <w:basedOn w:val="VerbatimChar"/>
     <w:rPr>
@@ -1363,7 +1358,7 @@
       <w:i/>
     </w:rPr>
   </w:style>
-  <w:style w:customStyle="1" w:styleId="CommentVarTok" w:type="character">
+  <w:style w:type="character" w:customStyle="1" w:styleId="CommentVarTok">
     <w:name w:val="CommentVarTok"/>
     <w:basedOn w:val="VerbatimChar"/>
     <w:rPr>
@@ -1372,28 +1367,28 @@
       <w:i/>
     </w:rPr>
   </w:style>
-  <w:style w:customStyle="1" w:styleId="OtherTok" w:type="character">
+  <w:style w:type="character" w:customStyle="1" w:styleId="OtherTok">
     <w:name w:val="OtherTok"/>
     <w:basedOn w:val="VerbatimChar"/>
     <w:rPr>
       <w:color w:val="007020"/>
     </w:rPr>
   </w:style>
-  <w:style w:customStyle="1" w:styleId="FunctionTok" w:type="character">
+  <w:style w:type="character" w:customStyle="1" w:styleId="FunctionTok">
     <w:name w:val="FunctionTok"/>
     <w:basedOn w:val="VerbatimChar"/>
     <w:rPr>
       <w:color w:val="06287e"/>
     </w:rPr>
   </w:style>
-  <w:style w:customStyle="1" w:styleId="VariableTok" w:type="character">
+  <w:style w:type="character" w:customStyle="1" w:styleId="VariableTok">
     <w:name w:val="VariableTok"/>
     <w:basedOn w:val="VerbatimChar"/>
     <w:rPr>
       <w:color w:val="19177c"/>
     </w:rPr>
   </w:style>
-  <w:style w:customStyle="1" w:styleId="ControlFlowTok" w:type="character">
+  <w:style w:type="character" w:customStyle="1" w:styleId="ControlFlowTok">
     <w:name w:val="ControlFlowTok"/>
     <w:basedOn w:val="VerbatimChar"/>
     <w:rPr>
@@ -1401,45 +1396,45 @@
       <w:b/>
     </w:rPr>
   </w:style>
-  <w:style w:customStyle="1" w:styleId="OperatorTok" w:type="character">
+  <w:style w:type="character" w:customStyle="1" w:styleId="OperatorTok">
     <w:name w:val="OperatorTok"/>
     <w:basedOn w:val="VerbatimChar"/>
     <w:rPr>
       <w:color w:val="666666"/>
     </w:rPr>
   </w:style>
-  <w:style w:customStyle="1" w:styleId="BuiltInTok" w:type="character">
+  <w:style w:type="character" w:customStyle="1" w:styleId="BuiltInTok">
     <w:name w:val="BuiltInTok"/>
     <w:basedOn w:val="VerbatimChar"/>
     <w:rPr>
       <w:color w:val="008000"/>
     </w:rPr>
   </w:style>
-  <w:style w:customStyle="1" w:styleId="ExtensionTok" w:type="character">
+  <w:style w:type="character" w:customStyle="1" w:styleId="ExtensionTok">
     <w:name w:val="ExtensionTok"/>
     <w:basedOn w:val="VerbatimChar"/>
     <w:rPr/>
   </w:style>
-  <w:style w:customStyle="1" w:styleId="PreprocessorTok" w:type="character">
+  <w:style w:type="character" w:customStyle="1" w:styleId="PreprocessorTok">
     <w:name w:val="PreprocessorTok"/>
     <w:basedOn w:val="VerbatimChar"/>
     <w:rPr>
       <w:color w:val="bc7a00"/>
     </w:rPr>
   </w:style>
-  <w:style w:customStyle="1" w:styleId="AttributeTok" w:type="character">
+  <w:style w:type="character" w:customStyle="1" w:styleId="AttributeTok">
     <w:name w:val="AttributeTok"/>
     <w:basedOn w:val="VerbatimChar"/>
     <w:rPr>
       <w:color w:val="7d9029"/>
     </w:rPr>
   </w:style>
-  <w:style w:customStyle="1" w:styleId="RegionMarkerTok" w:type="character">
+  <w:style w:type="character" w:customStyle="1" w:styleId="RegionMarkerTok">
     <w:name w:val="RegionMarkerTok"/>
     <w:basedOn w:val="VerbatimChar"/>
     <w:rPr/>
   </w:style>
-  <w:style w:customStyle="1" w:styleId="InformationTok" w:type="character">
+  <w:style w:type="character" w:customStyle="1" w:styleId="InformationTok">
     <w:name w:val="InformationTok"/>
     <w:basedOn w:val="VerbatimChar"/>
     <w:rPr>
@@ -1448,7 +1443,7 @@
       <w:i/>
     </w:rPr>
   </w:style>
-  <w:style w:customStyle="1" w:styleId="WarningTok" w:type="character">
+  <w:style w:type="character" w:customStyle="1" w:styleId="WarningTok">
     <w:name w:val="WarningTok"/>
     <w:basedOn w:val="VerbatimChar"/>
     <w:rPr>
@@ -1457,7 +1452,7 @@
       <w:i/>
     </w:rPr>
   </w:style>
-  <w:style w:customStyle="1" w:styleId="AlertTok" w:type="character">
+  <w:style w:type="character" w:customStyle="1" w:styleId="AlertTok">
     <w:name w:val="AlertTok"/>
     <w:basedOn w:val="VerbatimChar"/>
     <w:rPr>
@@ -1465,7 +1460,7 @@
       <w:b/>
     </w:rPr>
   </w:style>
-  <w:style w:customStyle="1" w:styleId="ErrorTok" w:type="character">
+  <w:style w:type="character" w:customStyle="1" w:styleId="ErrorTok">
     <w:name w:val="ErrorTok"/>
     <w:basedOn w:val="VerbatimChar"/>
     <w:rPr>
@@ -1473,7 +1468,7 @@
       <w:b/>
     </w:rPr>
   </w:style>
-  <w:style w:customStyle="1" w:styleId="NormalTok" w:type="character">
+  <w:style w:type="character" w:customStyle="1" w:styleId="NormalTok">
     <w:name w:val="NormalTok"/>
     <w:basedOn w:val="VerbatimChar"/>
     <w:rPr/>

</xml_diff>

<commit_message>
Sync to v3.10.1: script, README, QUICK START, docs refreshed
Co-Authored-By: Claude Sonnet 5.5 <noreply@anthropic.com>
Claude-Session: https://claude.ai/code/session_01Mi9NdRkBNE4jMUjYC8NqG1
</commit_message>
<xml_diff>
--- a/docs/Watchlog - IT Summary.docx
+++ b/docs/Watchlog - IT Summary.docx
@@ -6,7 +6,6 @@
     <w:p>
       <w:pPr>
         <w:pStyle w:val="Heading1"/>
-        <w:spacing w:before="160" w:after="40"/>
       </w:pPr>
       <w:r>
         <w:t xml:space="preserve">Watchlog: information for IT</w:t>
@@ -15,57 +14,38 @@
     <w:p>
       <w:pPr>
         <w:pStyle w:val="FirstParagraph"/>
-        <w:spacing w:before="40" w:after="40"/>
-      </w:pPr>
-      <w:r>
-        <w:rPr>
-          <w:sz w:val="20"/>
-        </w:rPr>
-        <w:t xml:space="preserve">Oct 22, 2026 · Jakob</w:t>
+      </w:pPr>
+      <w:r>
+        <w:t xml:space="preserve">Oct 25, 2026 · Jakob</w:t>
       </w:r>
     </w:p>
     <w:p>
       <w:pPr>
         <w:pStyle w:val="BodyText"/>
-        <w:spacing w:before="40" w:after="40"/>
-      </w:pPr>
-      <w:r>
-        <w:rPr>
-          <w:sz w:val="20"/>
-        </w:rPr>
+      </w:pPr>
+      <w:r>
         <w:t xml:space="preserve">Watchlog is a small Windows program I built that types our standard surveillance log entries. I type a short code like</w:t>
       </w:r>
       <w:r>
-        <w:rPr>
-          <w:sz w:val="20"/>
-        </w:rPr>
         <w:t xml:space="preserve"> </w:t>
       </w:r>
       <w:r>
         <w:rPr>
           <w:rStyle w:val="VerbatimChar"/>
-          <w:sz w:val="20"/>
         </w:rPr>
         <w:t xml:space="preserve">;interior</w:t>
       </w:r>
       <w:r>
-        <w:rPr>
-          <w:sz w:val="20"/>
-        </w:rPr>
         <w:t xml:space="preserve"> </w:t>
       </w:r>
       <w:r>
-        <w:rPr>
-          <w:sz w:val="20"/>
-        </w:rPr>
-        <w:t xml:space="preserve">and the full wording appears. It runs on AutoHotkey v2, a free and widely used scripting tool, and the program is one plain text file anyone can read. I’ve been testing it myself since October 13. I’m asking for approval so other operators and supervisors can use it if they choose to. There is no pilot phase: it would be the 3 operator bays and the supervisor bay, for whoever wants it.</w:t>
+        <w:t xml:space="preserve">and the full wording appears. It’s written in AutoHotkey v2 and comes as one Watchlog.exe with the AutoHotkey runtime built in, so nothing else is installed. The same program is also available as one plain text script for anyone to read. I’m on version 3.10.1 and have been using it on my own shifts since October 13. I’m asking for approval so other operators and supervisors can use it if they choose to, on our 3 operator bays and the supervisor bay.</w:t>
       </w:r>
     </w:p>
     <w:bookmarkStart w:id="20" w:name="what-it-does-and-doesnt-do"/>
     <w:p>
       <w:pPr>
         <w:pStyle w:val="Heading2"/>
-        <w:spacing w:before="160" w:after="40"/>
       </w:pPr>
       <w:r>
         <w:t xml:space="preserve">What it does and doesn’t do</w:t>
@@ -78,12 +58,8 @@
           <w:numId w:val="1001"/>
         </w:numPr>
         <w:pStyle w:val="Compact"/>
-        <w:spacing w:before="40" w:after="40"/>
-      </w:pPr>
-      <w:r>
-        <w:rPr>
-          <w:sz w:val="20"/>
-        </w:rPr>
+      </w:pPr>
+      <w:r>
         <w:t xml:space="preserve">It types and pastes what the operator would have typed. The operator still saves the entry. It doesn’t change iTrak, SDS or any other system.</w:t>
       </w:r>
     </w:p>
@@ -94,13 +70,9 @@
           <w:numId w:val="1001"/>
         </w:numPr>
         <w:pStyle w:val="Compact"/>
-        <w:spacing w:before="40" w:after="40"/>
-      </w:pPr>
-      <w:r>
-        <w:rPr>
-          <w:sz w:val="20"/>
-        </w:rPr>
-        <w:t xml:space="preserve">It doesn’t connect to the internet or send anything anywhere. Its files only travel through OneDrive and SharePoint under our normal Microsoft 365 permissions.</w:t>
+      </w:pPr>
+      <w:r>
+        <w:t xml:space="preserve">It clears the Alert Grid list when the operator presses Caps Lock or Ctrl+Alt+A. It clicks the same steps as by hand (Ctrl+A, right-click, Acknowledge as received, Submit, OK) using screen positions taught once per PC. The Acknowledge box is filled in by Alert Grid with the operator’s own login. Watchlog never reads or types into it.</w:t>
       </w:r>
     </w:p>
     <w:p>
@@ -110,13 +82,9 @@
           <w:numId w:val="1001"/>
         </w:numPr>
         <w:pStyle w:val="Compact"/>
-        <w:spacing w:before="40" w:after="40"/>
-      </w:pPr>
-      <w:r>
-        <w:rPr>
-          <w:sz w:val="20"/>
-        </w:rPr>
-        <w:t xml:space="preserve">It doesn’t record what anyone types. It only watches for its own codes.</w:t>
+      </w:pPr>
+      <w:r>
+        <w:t xml:space="preserve">SDS signs the operator out after an hour. Watchlog types the saved SDS login again about 62 minutes after an SDS login the operator did, only if SDS is on its login screen, and then puts the operator’s previous window back. It retries once a minute up to 6 times and can be turned off in Settings &gt; Logins.</w:t>
       </w:r>
     </w:p>
     <w:p>
@@ -126,13 +94,21 @@
           <w:numId w:val="1001"/>
         </w:numPr>
         <w:pStyle w:val="Compact"/>
-        <w:spacing w:before="40" w:after="40"/>
-      </w:pPr>
-      <w:r>
-        <w:rPr>
-          <w:sz w:val="20"/>
-        </w:rPr>
-        <w:t xml:space="preserve">It needs no administrator rights. Everything it saves is in the user’s own folders and the user’s own part of the registry.</w:t>
+      </w:pPr>
+      <w:r>
+        <w:t xml:space="preserve">It doesn’t connect to the internet or send anything anywhere. Its files only travel through OneDrive and SharePoint under our normal Microsoft 365 permissions.</w:t>
+      </w:r>
+    </w:p>
+    <w:p>
+      <w:pPr>
+        <w:numPr>
+          <w:ilvl w:val="0"/>
+          <w:numId w:val="1001"/>
+        </w:numPr>
+        <w:pStyle w:val="Compact"/>
+      </w:pPr>
+      <w:r>
+        <w:t xml:space="preserve">It doesn’t record what anyone types. It only watches for its own codes. It reads the clipboard only for a form box that takes a copy, and keeps a copied facial rec alert number or match % in memory for 2 minutes at most.</w:t>
       </w:r>
     </w:p>
     <w:bookmarkEnd w:id="20"/>
@@ -140,7 +116,6 @@
     <w:p>
       <w:pPr>
         <w:pStyle w:val="Heading2"/>
-        <w:spacing w:before="160" w:after="40"/>
       </w:pPr>
       <w:r>
         <w:t xml:space="preserve">Passwords and saved information</w:t>
@@ -153,13 +128,9 @@
           <w:numId w:val="1002"/>
         </w:numPr>
         <w:pStyle w:val="Compact"/>
-        <w:spacing w:before="40" w:after="40"/>
-      </w:pPr>
-      <w:r>
-        <w:rPr>
-          <w:sz w:val="20"/>
-        </w:rPr>
-        <w:t xml:space="preserve">Passwords are kept in Windows Credential Manager, on that PC, for that Windows user. They are never in a file, never synced and never shown. A password is only typed when that login’s code is typed.</w:t>
+      </w:pPr>
+      <w:r>
+        <w:t xml:space="preserve">Passwords are kept in Windows Credential Manager, on that PC, for that Windows user. They are never in a file, never synced and never shown.</w:t>
       </w:r>
     </w:p>
     <w:p>
@@ -169,13 +140,27 @@
           <w:numId w:val="1002"/>
         </w:numPr>
         <w:pStyle w:val="Compact"/>
-        <w:spacing w:before="40" w:after="40"/>
-      </w:pPr>
-      <w:r>
-        <w:rPr>
-          <w:sz w:val="20"/>
-        </w:rPr>
-        <w:t xml:space="preserve">The shift journal keeps the time, template name and text of each entry for 30 days, then deletes it. It can be set to counts only, or off.</w:t>
+      </w:pPr>
+      <w:r>
+        <w:t xml:space="preserve">A password is typed only when that login’s code is typed, when the operator answers Yes to</w:t>
+      </w:r>
+      <w:r>
+        <w:t xml:space="preserve"> </w:t>
+      </w:r>
+      <w:r>
+        <w:t xml:space="preserve">“</w:t>
+      </w:r>
+      <w:r>
+        <w:t xml:space="preserve">Log in to SDS?</w:t>
+      </w:r>
+      <w:r>
+        <w:t xml:space="preserve">”</w:t>
+      </w:r>
+      <w:r>
+        <w:t xml:space="preserve"> </w:t>
+      </w:r>
+      <w:r>
+        <w:t xml:space="preserve">or to the start of shift sign-in, or for the SDS sign-back-in above. Each time it first checks that the window in front is one that login is locked to. Logins with no lock are never typed automatically.</w:t>
       </w:r>
     </w:p>
     <w:p>
@@ -185,13 +170,9 @@
           <w:numId w:val="1002"/>
         </w:numPr>
         <w:pStyle w:val="Compact"/>
-        <w:spacing w:before="40" w:after="40"/>
-      </w:pPr>
-      <w:r>
-        <w:rPr>
-          <w:sz w:val="20"/>
-        </w:rPr>
-        <w:t xml:space="preserve">The activity log stays on the PC and never holds passwords or log text. The registry holds only the last login time.</w:t>
+      </w:pPr>
+      <w:r>
+        <w:t xml:space="preserve">The shift journal keeps the time, template name and text of each entry for 30 days, then deletes it. It can be set to counts only, or off.</w:t>
       </w:r>
     </w:p>
     <w:p>
@@ -201,12 +182,20 @@
           <w:numId w:val="1002"/>
         </w:numPr>
         <w:pStyle w:val="Compact"/>
-        <w:spacing w:before="40" w:after="40"/>
-      </w:pPr>
-      <w:r>
-        <w:rPr>
-          <w:sz w:val="20"/>
-        </w:rPr>
+      </w:pPr>
+      <w:r>
+        <w:t xml:space="preserve">On the PC only: the activity log (never passwords or log text), Alert Grid click positions, window positions, time saved counts and a few last-used box values. The registry holds the last login time and the uninstall entry.</w:t>
+      </w:r>
+    </w:p>
+    <w:p>
+      <w:pPr>
+        <w:numPr>
+          <w:ilvl w:val="0"/>
+          <w:numId w:val="1002"/>
+        </w:numPr>
+        <w:pStyle w:val="Compact"/>
+      </w:pPr>
+      <w:r>
         <w:t xml:space="preserve">Tray menu &gt; Security and status shows all of this for the PC in front of you, with a Copy report button.</w:t>
       </w:r>
     </w:p>
@@ -215,7 +204,6 @@
     <w:p>
       <w:pPr>
         <w:pStyle w:val="Heading2"/>
-        <w:spacing w:before="160" w:after="40"/>
       </w:pPr>
       <w:r>
         <w:t xml:space="preserve">Updates and shared files</w:t>
@@ -224,43 +212,24 @@
     <w:p>
       <w:pPr>
         <w:pStyle w:val="FirstParagraph"/>
-        <w:spacing w:before="40" w:after="40"/>
-      </w:pPr>
-      <w:r>
-        <w:rPr>
-          <w:sz w:val="20"/>
-        </w:rPr>
-        <w:t xml:space="preserve">The approved wording is one file in a SharePoint folder that the supervisors look after. Each PC shows a short check code, so it’s easy to confirm every bay matches. A new version of the program can go in the same folder. Each PC asks</w:t>
-      </w:r>
-      <w:r>
-        <w:rPr>
-          <w:sz w:val="20"/>
-        </w:rPr>
+      </w:pPr>
+      <w:r>
+        <w:t xml:space="preserve">The approved wording is one file in a SharePoint folder that the supervisors look after. Each PC shows a short check code, so it’s easy to confirm every bay matches. A new Watchlog.exe can go in the same folder. Each PC asks</w:t>
+      </w:r>
+      <w:r>
         <w:t xml:space="preserve"> </w:t>
       </w:r>
       <w:r>
-        <w:rPr>
-          <w:sz w:val="20"/>
-        </w:rPr>
         <w:t xml:space="preserve">“</w:t>
       </w:r>
       <w:r>
-        <w:rPr>
-          <w:sz w:val="20"/>
-        </w:rPr>
         <w:t xml:space="preserve">Update now?</w:t>
       </w:r>
       <w:r>
-        <w:rPr>
-          <w:sz w:val="20"/>
-        </w:rPr>
         <w:t xml:space="preserve">”</w:t>
       </w:r>
       <w:r>
-        <w:rPr>
-          <w:sz w:val="20"/>
-        </w:rPr>
-        <w:t xml:space="preserve">, checks that the file loads, keeps a backup and refuses a broken file. That means whoever can edit the folder controls what the bays run, so I’d ask that edit access be limited to the supervisors and me.</w:t>
+        <w:t xml:space="preserve">, checks the file, keeps a backup and refuses a broken one. That means whoever can edit the folder controls what the bays run, so I’d ask that edit access be limited to the supervisors and me. A user can also point their own PC at a folder of their own for testing, which only affects that PC.</w:t>
       </w:r>
     </w:p>
     <w:bookmarkEnd w:id="22"/>
@@ -268,7 +237,6 @@
     <w:p>
       <w:pPr>
         <w:pStyle w:val="Heading2"/>
-        <w:spacing w:before="160" w:after="40"/>
       </w:pPr>
       <w:r>
         <w:t xml:space="preserve">What I’m asking IT to approve</w:t>
@@ -281,13 +249,9 @@
           <w:numId w:val="1003"/>
         </w:numPr>
         <w:pStyle w:val="Compact"/>
-        <w:spacing w:before="40" w:after="40"/>
-      </w:pPr>
-      <w:r>
-        <w:rPr>
-          <w:sz w:val="20"/>
-        </w:rPr>
-        <w:t xml:space="preserve">AutoHotkey v2 on the 4 PCs (or I can build a single Watchlog.exe if you’d rather).</w:t>
+      </w:pPr>
+      <w:r>
+        <w:t xml:space="preserve">Watchlog.exe installed per user, with no admin rights, and starting with Windows. It isn’t signed, so SmartScreen may warn once.</w:t>
       </w:r>
     </w:p>
     <w:p>
@@ -297,13 +261,9 @@
           <w:numId w:val="1003"/>
         </w:numPr>
         <w:pStyle w:val="Compact"/>
-        <w:spacing w:before="40" w:after="40"/>
-      </w:pPr>
-      <w:r>
-        <w:rPr>
-          <w:sz w:val="20"/>
-        </w:rPr>
-        <w:t xml:space="preserve">Passwords in Windows Credential Manager, typed on request.</w:t>
+      </w:pPr>
+      <w:r>
+        <w:t xml:space="preserve">Passwords in Windows Credential Manager, typed into the programs they’re locked to.</w:t>
       </w:r>
     </w:p>
     <w:p>
@@ -313,13 +273,9 @@
           <w:numId w:val="1003"/>
         </w:numPr>
         <w:pStyle w:val="Compact"/>
-        <w:spacing w:before="40" w:after="40"/>
-      </w:pPr>
-      <w:r>
-        <w:rPr>
-          <w:sz w:val="20"/>
-        </w:rPr>
-        <w:t xml:space="preserve">Watchlog starting with Windows.</w:t>
+      </w:pPr>
+      <w:r>
+        <w:t xml:space="preserve">Watchlog clicking through the Alert Grid acknowledge steps for the operator.</w:t>
       </w:r>
     </w:p>
     <w:p>
@@ -329,13 +285,9 @@
           <w:numId w:val="1003"/>
         </w:numPr>
         <w:pStyle w:val="Compact"/>
-        <w:spacing w:before="40" w:after="40"/>
-      </w:pPr>
-      <w:r>
-        <w:rPr>
-          <w:sz w:val="20"/>
-        </w:rPr>
-        <w:t xml:space="preserve">The 30 day shift journal (or counts only).</w:t>
+      </w:pPr>
+      <w:r>
+        <w:t xml:space="preserve">The automatic SDS sign-back-in (can be off).</w:t>
       </w:r>
     </w:p>
     <w:p>
@@ -345,12 +297,20 @@
           <w:numId w:val="1003"/>
         </w:numPr>
         <w:pStyle w:val="Compact"/>
-        <w:spacing w:before="40" w:after="40"/>
-      </w:pPr>
-      <w:r>
-        <w:rPr>
-          <w:sz w:val="20"/>
-        </w:rPr>
+      </w:pPr>
+      <w:r>
+        <w:t xml:space="preserve">The 30 day shift journal (or counts only).</w:t>
+      </w:r>
+    </w:p>
+    <w:p>
+      <w:pPr>
+        <w:numPr>
+          <w:ilvl w:val="0"/>
+          <w:numId w:val="1003"/>
+        </w:numPr>
+        <w:pStyle w:val="Compact"/>
+      </w:pPr>
+      <w:r>
         <w:t xml:space="preserve">Edit access to the SharePoint template folder.</w:t>
       </w:r>
     </w:p>
@@ -359,7 +319,6 @@
     <w:p>
       <w:pPr>
         <w:pStyle w:val="Heading2"/>
-        <w:spacing w:before="160" w:after="40"/>
       </w:pPr>
       <w:r>
         <w:t xml:space="preserve">Setting up and removing it</w:t>
@@ -368,88 +327,84 @@
     <w:p>
       <w:pPr>
         <w:pStyle w:val="FirstParagraph"/>
-        <w:spacing w:before="40" w:after="40"/>
-      </w:pPr>
-      <w:r>
-        <w:rPr>
-          <w:sz w:val="20"/>
-        </w:rPr>
-        <w:t xml:space="preserve">Setup per PC: install AutoHotkey, make sure OneDrive starts with Windows and the Watchlog folder is set to Always keep on this device, open Watchlog and fill in the welcome window, tick Start with Windows, then check Security and status.</w:t>
-      </w:r>
-    </w:p>
-    <w:p>
-      <w:pPr>
-        <w:pStyle w:val="BodyText"/>
-        <w:spacing w:before="40" w:after="40"/>
-      </w:pPr>
-      <w:r>
-        <w:rPr>
-          <w:sz w:val="20"/>
-        </w:rPr>
-        <w:t xml:space="preserve">To remove it, choose Exit from the tray icon, remove each login in Settings (which deletes its saved password), then delete the Startup shortcut, the Watchlog folder,</w:t>
-      </w:r>
-      <w:r>
-        <w:rPr>
-          <w:sz w:val="20"/>
-        </w:rPr>
+      </w:pPr>
+      <w:r>
+        <w:t xml:space="preserve">Setup per PC: run Watchlog.exe and say yes to installing (it goes in</w:t>
+      </w:r>
+      <w:r>
         <w:t xml:space="preserve"> </w:t>
       </w:r>
       <w:r>
         <w:rPr>
           <w:rStyle w:val="VerbatimChar"/>
-          <w:sz w:val="20"/>
+        </w:rPr>
+        <w:t xml:space="preserve">%LOCALAPPDATA%\Programs\Watchlog</w:t>
+      </w:r>
+      <w:r>
+        <w:t xml:space="preserve">, with a Start menu entry and a Startup shortcut), go through the welcome window, then teach the Alert Grid clicks once with Ctrl+Alt+Shift+A. Settings live in</w:t>
+      </w:r>
+      <w:r>
+        <w:t xml:space="preserve"> </w:t>
+      </w:r>
+      <w:r>
+        <w:rPr>
+          <w:rStyle w:val="VerbatimChar"/>
+        </w:rPr>
+        <w:t xml:space="preserve">Documents\Watchlog</w:t>
+      </w:r>
+      <w:r>
+        <w:t xml:space="preserve">, so OneDrive needs to start with Windows.</w:t>
+      </w:r>
+    </w:p>
+    <w:p>
+      <w:pPr>
+        <w:pStyle w:val="BodyText"/>
+      </w:pPr>
+      <w:r>
+        <w:t xml:space="preserve">To remove it, use Settings &gt; Apps &gt; Watchlog. It offers to delete the saved passwords and leaves the operator’s settings and journal in Documents.</w:t>
+      </w:r>
+      <w:r>
+        <w:t xml:space="preserve"> </w:t>
+      </w:r>
+      <w:r>
+        <w:rPr>
+          <w:rStyle w:val="VerbatimChar"/>
         </w:rPr>
         <w:t xml:space="preserve">%LOCALAPPDATA%\Watchlog</w:t>
       </w:r>
       <w:r>
-        <w:rPr>
-          <w:sz w:val="20"/>
-        </w:rPr>
         <w:t xml:space="preserve"> </w:t>
       </w:r>
       <w:r>
-        <w:rPr>
-          <w:sz w:val="20"/>
-        </w:rPr>
         <w:t xml:space="preserve">and</w:t>
       </w:r>
       <w:r>
-        <w:rPr>
-          <w:sz w:val="20"/>
-        </w:rPr>
         <w:t xml:space="preserve"> </w:t>
       </w:r>
       <w:r>
         <w:rPr>
           <w:rStyle w:val="VerbatimChar"/>
-          <w:sz w:val="20"/>
         </w:rPr>
         <w:t xml:space="preserve">HKCU\Software\Watchlog</w:t>
       </w:r>
       <w:r>
-        <w:rPr>
-          <w:sz w:val="20"/>
-        </w:rPr>
-        <w:t xml:space="preserve">.</w:t>
+        <w:t xml:space="preserve"> </w:t>
+      </w:r>
+      <w:r>
+        <w:t xml:space="preserve">can then be deleted.</w:t>
       </w:r>
     </w:p>
     <w:p>
       <w:pPr>
         <w:pStyle w:val="BodyText"/>
-        <w:spacing w:before="40" w:after="40"/>
-      </w:pPr>
-      <w:r>
-        <w:rPr>
-          <w:sz w:val="20"/>
-        </w:rPr>
+      </w:pPr>
+      <w:r>
         <w:t xml:space="preserve">I’m happy to show it working to anyone who’d like to see it. The full overview has more detail.</w:t>
       </w:r>
     </w:p>
     <w:bookmarkEnd w:id="24"/>
     <w:bookmarkEnd w:id="25"/>
-    <w:sectPr>
-      <w:pgMar w:left="1152" w:right="1152" w:top="864" w:bottom="864"/>
-    </w:sectPr>
+    <w:sectPr/>
   </w:body>
 </w:document>
 </file>
@@ -779,6 +734,10 @@
   <w:style w:default="1" w:styleId="Normal" w:type="paragraph">
     <w:name w:val="Normal"/>
     <w:qFormat/>
+    <w:rPr>
+      <w:rFonts w:ascii="Calibri" w:hAnsi="Calibri"/>
+      <w:sz w:val="22"/>
+    </w:rPr>
   </w:style>
   <w:style w:styleId="BodyText" w:type="paragraph">
     <w:name w:val="Body Text"/>
@@ -788,12 +747,20 @@
       <w:spacing w:after="180" w:before="180"/>
     </w:pPr>
     <w:qFormat/>
+    <w:rPr>
+      <w:rFonts w:ascii="Calibri" w:hAnsi="Calibri"/>
+      <w:sz w:val="22"/>
+    </w:rPr>
   </w:style>
   <w:style w:customStyle="1" w:styleId="FirstParagraph" w:type="paragraph">
     <w:name w:val="First Paragraph"/>
     <w:basedOn w:val="BodyText"/>
     <w:next w:val="BodyText"/>
     <w:qFormat/>
+    <w:rPr>
+      <w:rFonts w:ascii="Calibri" w:hAnsi="Calibri"/>
+      <w:sz w:val="22"/>
+    </w:rPr>
   </w:style>
   <w:style w:customStyle="1" w:styleId="Compact" w:type="paragraph">
     <w:name w:val="Compact"/>
@@ -802,6 +769,10 @@
     <w:pPr>
       <w:spacing w:after="36" w:before="36"/>
     </w:pPr>
+    <w:rPr>
+      <w:rFonts w:ascii="Calibri" w:hAnsi="Calibri"/>
+      <w:sz w:val="21"/>
+    </w:rPr>
   </w:style>
   <w:style w:styleId="Title" w:type="paragraph">
     <w:name w:val="Title"/>
@@ -815,11 +786,11 @@
       <w:jc w:val="center"/>
     </w:pPr>
     <w:rPr>
-      <w:rFonts w:asciiTheme="majorHAnsi" w:cstheme="majorBidi" w:eastAsiaTheme="majorEastAsia" w:hAnsiTheme="majorHAnsi"/>
+      <w:rFonts w:ascii="Calibri" w:asciiTheme="majorHAnsi" w:cstheme="majorBidi" w:eastAsiaTheme="majorEastAsia" w:hAnsi="Calibri" w:hAnsiTheme="majorHAnsi"/>
       <w:b/>
       <w:bCs/>
-      <w:color w:themeColor="accent1" w:themeShade="B5" w:val="345A8A"/>
-      <w:sz w:val="36"/>
+      <w:color w:val="1F5F5F"/>
+      <w:sz w:val="44"/>
       <w:szCs w:val="36"/>
     </w:rPr>
   </w:style>
@@ -835,6 +806,7 @@
       <w:jc w:val="center"/>
     </w:pPr>
     <w:rPr>
+      <w:rFonts w:ascii="Calibri" w:hAnsi="Calibri"/>
       <w:sz w:val="30"/>
       <w:szCs w:val="30"/>
     </w:rPr>
@@ -848,6 +820,9 @@
       <w:keepLines/>
       <w:jc w:val="center"/>
     </w:pPr>
+    <w:rPr>
+      <w:rFonts w:ascii="Calibri" w:hAnsi="Calibri"/>
+    </w:rPr>
   </w:style>
   <w:style w:styleId="Date" w:type="paragraph">
     <w:name w:val="Date"/>
@@ -858,6 +833,9 @@
       <w:keepLines/>
       <w:jc w:val="center"/>
     </w:pPr>
+    <w:rPr>
+      <w:rFonts w:ascii="Calibri" w:hAnsi="Calibri"/>
+    </w:rPr>
   </w:style>
   <w:style w:customStyle="1" w:styleId="AbstractTitle" w:type="paragraph">
     <w:name w:val="Abstract Title"/>
@@ -873,6 +851,7 @@
     <w:rPr>
       <w:sz w:val="20"/>
       <w:szCs w:val="20"/>
+      <w:rFonts w:ascii="Calibri" w:hAnsi="Calibri"/>
       <w:b/>
       <w:color w:val="345A8A"/>
       &gt;
@@ -889,6 +868,7 @@
       <w:spacing w:after="300" w:before="100"/>
     </w:pPr>
     <w:rPr>
+      <w:rFonts w:ascii="Calibri" w:hAnsi="Calibri"/>
       <w:sz w:val="20"/>
       <w:szCs w:val="20"/>
     </w:rPr>
@@ -899,7 +879,9 @@
     <w:next w:val="Bibliography"/>
     <w:qFormat/>
     <w:pPr/>
-    <w:rPr/>
+    <w:rPr>
+      <w:rFonts w:ascii="Calibri" w:hAnsi="Calibri"/>
+    </w:rPr>
   </w:style>
   <w:style w:styleId="Heading1" w:type="paragraph">
     <w:name w:val="Heading 1"/>
@@ -914,7 +896,7 @@
       <w:outlineLvl w:val="0"/>
     </w:pPr>
     <w:rPr>
-      <w:rFonts w:asciiTheme="majorHAnsi" w:cstheme="majorBidi" w:eastAsiaTheme="majorEastAsia" w:hAnsiTheme="majorHAnsi"/>
+      <w:rFonts w:ascii="Calibri" w:asciiTheme="majorHAnsi" w:cstheme="majorBidi" w:eastAsiaTheme="majorEastAsia" w:hAnsi="Calibri" w:hAnsiTheme="majorHAnsi"/>
       <w:b/>
       <w:bCs/>
       <w:color w:themeColor="accent1" w:val="4F81BD"/>
@@ -936,7 +918,7 @@
       <w:outlineLvl w:val="1"/>
     </w:pPr>
     <w:rPr>
-      <w:rFonts w:asciiTheme="majorHAnsi" w:cstheme="majorBidi" w:eastAsiaTheme="majorEastAsia" w:hAnsiTheme="majorHAnsi"/>
+      <w:rFonts w:ascii="Calibri" w:asciiTheme="majorHAnsi" w:cstheme="majorBidi" w:eastAsiaTheme="majorEastAsia" w:hAnsi="Calibri" w:hAnsiTheme="majorHAnsi"/>
       <w:b/>
       <w:bCs/>
       <w:color w:themeColor="accent1" w:val="4F81BD"/>
@@ -958,7 +940,7 @@
       <w:outlineLvl w:val="2"/>
     </w:pPr>
     <w:rPr>
-      <w:rFonts w:asciiTheme="majorHAnsi" w:cstheme="majorBidi" w:eastAsiaTheme="majorEastAsia" w:hAnsiTheme="majorHAnsi"/>
+      <w:rFonts w:ascii="Calibri" w:asciiTheme="majorHAnsi" w:cstheme="majorBidi" w:eastAsiaTheme="majorEastAsia" w:hAnsi="Calibri" w:hAnsiTheme="majorHAnsi"/>
       <w:b/>
       <w:bCs/>
       <w:color w:themeColor="accent1" w:val="4F81BD"/>
@@ -980,7 +962,7 @@
       <w:outlineLvl w:val="3"/>
     </w:pPr>
     <w:rPr>
-      <w:rFonts w:asciiTheme="majorHAnsi" w:cstheme="majorBidi" w:eastAsiaTheme="majorEastAsia" w:hAnsiTheme="majorHAnsi"/>
+      <w:rFonts w:ascii="Calibri" w:asciiTheme="majorHAnsi" w:cstheme="majorBidi" w:eastAsiaTheme="majorEastAsia" w:hAnsi="Calibri" w:hAnsiTheme="majorHAnsi"/>
       <w:i/>
       <w:bCs/>
       <w:color w:themeColor="accent1" w:val="4F81BD"/>
@@ -1002,7 +984,7 @@
       <w:outlineLvl w:val="4"/>
     </w:pPr>
     <w:rPr>
-      <w:rFonts w:asciiTheme="majorHAnsi" w:cstheme="majorBidi" w:eastAsiaTheme="majorEastAsia" w:hAnsiTheme="majorHAnsi"/>
+      <w:rFonts w:ascii="Calibri" w:asciiTheme="majorHAnsi" w:cstheme="majorBidi" w:eastAsiaTheme="majorEastAsia" w:hAnsi="Calibri" w:hAnsiTheme="majorHAnsi"/>
       <w:iCs/>
       <w:color w:themeColor="accent1" w:val="4F81BD"/>
       <w:sz w:val="24"/>
@@ -1023,7 +1005,7 @@
       <w:outlineLvl w:val="5"/>
     </w:pPr>
     <w:rPr>
-      <w:rFonts w:asciiTheme="majorHAnsi" w:cstheme="majorBidi" w:eastAsiaTheme="majorEastAsia" w:hAnsiTheme="majorHAnsi"/>
+      <w:rFonts w:ascii="Calibri" w:asciiTheme="majorHAnsi" w:cstheme="majorBidi" w:eastAsiaTheme="majorEastAsia" w:hAnsi="Calibri" w:hAnsiTheme="majorHAnsi"/>
       <w:color w:themeColor="accent1" w:val="4F81BD"/>
       <w:sz w:val="24"/>
       <w:szCs w:val="24"/>
@@ -1043,7 +1025,7 @@
       <w:outlineLvl w:val="6"/>
     </w:pPr>
     <w:rPr>
-      <w:rFonts w:asciiTheme="majorHAnsi" w:cstheme="majorBidi" w:eastAsiaTheme="majorEastAsia" w:hAnsiTheme="majorHAnsi"/>
+      <w:rFonts w:ascii="Calibri" w:asciiTheme="majorHAnsi" w:cstheme="majorBidi" w:eastAsiaTheme="majorEastAsia" w:hAnsi="Calibri" w:hAnsiTheme="majorHAnsi"/>
       <w:color w:themeColor="accent1" w:val="4F81BD"/>
       <w:sz w:val="24"/>
       <w:szCs w:val="24"/>
@@ -1063,7 +1045,7 @@
       <w:outlineLvl w:val="7"/>
     </w:pPr>
     <w:rPr>
-      <w:rFonts w:asciiTheme="majorHAnsi" w:cstheme="majorBidi" w:eastAsiaTheme="majorEastAsia" w:hAnsiTheme="majorHAnsi"/>
+      <w:rFonts w:ascii="Calibri" w:asciiTheme="majorHAnsi" w:cstheme="majorBidi" w:eastAsiaTheme="majorEastAsia" w:hAnsi="Calibri" w:hAnsiTheme="majorHAnsi"/>
       <w:color w:themeColor="accent1" w:val="4F81BD"/>
       <w:sz w:val="24"/>
       <w:szCs w:val="24"/>
@@ -1083,7 +1065,7 @@
       <w:outlineLvl w:val="8"/>
     </w:pPr>
     <w:rPr>
-      <w:rFonts w:asciiTheme="majorHAnsi" w:cstheme="majorBidi" w:eastAsiaTheme="majorEastAsia" w:hAnsiTheme="majorHAnsi"/>
+      <w:rFonts w:ascii="Calibri" w:asciiTheme="majorHAnsi" w:cstheme="majorBidi" w:eastAsiaTheme="majorEastAsia" w:hAnsi="Calibri" w:hAnsiTheme="majorHAnsi"/>
       <w:color w:themeColor="accent1" w:val="4F81BD"/>
       <w:sz w:val="24"/>
       <w:szCs w:val="24"/>
@@ -1100,6 +1082,9 @@
       <w:spacing w:after="100" w:before="100"/>
       <w:ind w:firstLine="0" w:left="480" w:right="480"/>
     </w:pPr>
+    <w:rPr>
+      <w:rFonts w:ascii="Calibri" w:hAnsi="Calibri"/>
+    </w:rPr>
   </w:style>
   <w:style w:styleId="FootnoteText" w:type="paragraph">
     <w:name w:val="Footnote Text"/>
@@ -1108,11 +1093,17 @@
     <w:uiPriority w:val="9"/>
     <w:unhideWhenUsed/>
     <w:qFormat/>
+    <w:rPr>
+      <w:rFonts w:ascii="Calibri" w:hAnsi="Calibri"/>
+    </w:rPr>
   </w:style>
   <w:style w:default="1" w:styleId="DefaultParagraphFont" w:type="character">
     <w:name w:val="Default Paragraph Font"/>
     <w:semiHidden/>
     <w:unhideWhenUsed/>
+    <w:rPr>
+      <w:rFonts w:ascii="Calibri" w:hAnsi="Calibri"/>
+    </w:rPr>
   </w:style>
   <w:style w:default="1" w:styleId="Table" w:type="table">
     <w:name w:val="Table"/>
@@ -1120,6 +1111,9 @@
     <w:semiHidden/>
     <w:unhideWhenUsed/>
     <w:qFormat/>
+    <w:rPr>
+      <w:rFonts w:ascii="Calibri" w:hAnsi="Calibri"/>
+    </w:rPr>
     <w:tblPr>
       <w:tblInd w:type="dxa" w:w="0"/>
       <w:tblCellMar>
@@ -1155,12 +1149,16 @@
       <w:spacing w:after="0"/>
     </w:pPr>
     <w:rPr>
+      <w:rFonts w:ascii="Calibri" w:hAnsi="Calibri"/>
       <w:b/>
     </w:rPr>
   </w:style>
   <w:style w:customStyle="1" w:styleId="Definition" w:type="paragraph">
     <w:name w:val="Definition"/>
     <w:basedOn w:val="Normal"/>
+    <w:rPr>
+      <w:rFonts w:ascii="Calibri" w:hAnsi="Calibri"/>
+    </w:rPr>
   </w:style>
   <w:style w:styleId="Caption" w:type="paragraph">
     <w:name w:val="Caption"/>
@@ -1170,6 +1168,7 @@
       <w:spacing w:after="120" w:before="0"/>
     </w:pPr>
     <w:rPr>
+      <w:rFonts w:ascii="Calibri" w:hAnsi="Calibri"/>
       <w:i/>
     </w:rPr>
   </w:style>
@@ -1179,14 +1178,23 @@
     <w:pPr>
       <w:keepNext/>
     </w:pPr>
+    <w:rPr>
+      <w:rFonts w:ascii="Calibri" w:hAnsi="Calibri"/>
+    </w:rPr>
   </w:style>
   <w:style w:customStyle="1" w:styleId="ImageCaption" w:type="paragraph">
     <w:name w:val="Image Caption"/>
     <w:basedOn w:val="Caption"/>
+    <w:rPr>
+      <w:rFonts w:ascii="Calibri" w:hAnsi="Calibri"/>
+    </w:rPr>
   </w:style>
   <w:style w:customStyle="1" w:styleId="Figure" w:type="paragraph">
     <w:name w:val="Figure"/>
     <w:basedOn w:val="Normal"/>
+    <w:rPr>
+      <w:rFonts w:ascii="Calibri" w:hAnsi="Calibri"/>
+    </w:rPr>
   </w:style>
   <w:style w:customStyle="1" w:styleId="CaptionedFigure" w:type="paragraph">
     <w:name w:val="Captioned Figure"/>
@@ -1194,28 +1202,38 @@
     <w:pPr>
       <w:keepNext/>
     </w:pPr>
+    <w:rPr>
+      <w:rFonts w:ascii="Calibri" w:hAnsi="Calibri"/>
+    </w:rPr>
   </w:style>
   <w:style w:customStyle="1" w:styleId="BodyTextChar" w:type="character">
     <w:name w:val="Body Text Char"/>
     <w:basedOn w:val="DefaultParagraphFont"/>
     <w:link w:val="BodyText"/>
+    <w:rPr>
+      <w:rFonts w:ascii="Calibri" w:hAnsi="Calibri"/>
+    </w:rPr>
   </w:style>
   <w:style w:customStyle="1" w:styleId="VerbatimChar" w:type="character">
     <w:name w:val="Verbatim Char"/>
     <w:basedOn w:val="BodyTextChar"/>
     <w:rPr>
-      <w:rFonts w:ascii="Consolas" w:hAnsi="Consolas"/>
+      <w:rFonts w:ascii="Calibri" w:hAnsi="Calibri"/>
       <w:sz w:val="22"/>
     </w:rPr>
   </w:style>
   <w:style w:customStyle="1" w:styleId="SectionNumber" w:type="character">
     <w:name w:val="Section Number"/>
     <w:basedOn w:val="BodyTextChar"/>
+    <w:rPr>
+      <w:rFonts w:ascii="Calibri" w:hAnsi="Calibri"/>
+    </w:rPr>
   </w:style>
   <w:style w:styleId="FootnoteReference" w:type="character">
     <w:name w:val="Footnote Reference"/>
     <w:basedOn w:val="BodyTextChar"/>
     <w:rPr>
+      <w:rFonts w:ascii="Calibri" w:hAnsi="Calibri"/>
       <w:vertAlign w:val="superscript"/>
     </w:rPr>
   </w:style>
@@ -1223,6 +1241,7 @@
     <w:name w:val="Hyperlink"/>
     <w:basedOn w:val="BodyTextChar"/>
     <w:rPr>
+      <w:rFonts w:ascii="Calibri" w:hAnsi="Calibri"/>
       <w:color w:themeColor="accent1" w:val="4F81BD"/>
     </w:rPr>
   </w:style>
@@ -1238,13 +1257,13 @@
       <w:outlineLvl w:val="9"/>
     </w:pPr>
     <w:rPr>
-      <w:rFonts w:asciiTheme="majorHAnsi" w:cstheme="majorBidi" w:eastAsiaTheme="majorEastAsia" w:hAnsiTheme="majorHAnsi"/>
+      <w:rFonts w:ascii="Calibri" w:asciiTheme="majorHAnsi" w:cstheme="majorBidi" w:eastAsiaTheme="majorEastAsia" w:hAnsi="Calibri" w:hAnsiTheme="majorHAnsi"/>
       <w:b w:val="0"/>
       <w:bCs w:val="0"/>
       <w:color w:themeColor="accent1" w:themeShade="BF" w:val="365F91"/>
     </w:rPr>
   </w:style>
-  <w:style w:customStyle="1" w:styleId="SourceCode" w:type="paragraph">
+  <w:style w:type="paragraph" w:customStyle="1" w:styleId="SourceCode">
     <w:name w:val="Source Code"/>
     <w:basedOn w:val="Normal"/>
     <w:link w:val="VerbatimChar"/>
@@ -1252,7 +1271,7 @@
       <w:wordWrap w:val="off"/>
     </w:pPr>
   </w:style>
-  <w:style w:customStyle="1" w:styleId="KeywordTok" w:type="character">
+  <w:style w:type="character" w:customStyle="1" w:styleId="KeywordTok">
     <w:name w:val="KeywordTok"/>
     <w:basedOn w:val="VerbatimChar"/>
     <w:rPr>
@@ -1260,77 +1279,77 @@
       <w:b/>
     </w:rPr>
   </w:style>
-  <w:style w:customStyle="1" w:styleId="DataTypeTok" w:type="character">
+  <w:style w:type="character" w:customStyle="1" w:styleId="DataTypeTok">
     <w:name w:val="DataTypeTok"/>
     <w:basedOn w:val="VerbatimChar"/>
     <w:rPr>
       <w:color w:val="902000"/>
     </w:rPr>
   </w:style>
-  <w:style w:customStyle="1" w:styleId="DecValTok" w:type="character">
+  <w:style w:type="character" w:customStyle="1" w:styleId="DecValTok">
     <w:name w:val="DecValTok"/>
     <w:basedOn w:val="VerbatimChar"/>
     <w:rPr>
       <w:color w:val="40a070"/>
     </w:rPr>
   </w:style>
-  <w:style w:customStyle="1" w:styleId="BaseNTok" w:type="character">
+  <w:style w:type="character" w:customStyle="1" w:styleId="BaseNTok">
     <w:name w:val="BaseNTok"/>
     <w:basedOn w:val="VerbatimChar"/>
     <w:rPr>
       <w:color w:val="40a070"/>
     </w:rPr>
   </w:style>
-  <w:style w:customStyle="1" w:styleId="FloatTok" w:type="character">
+  <w:style w:type="character" w:customStyle="1" w:styleId="FloatTok">
     <w:name w:val="FloatTok"/>
     <w:basedOn w:val="VerbatimChar"/>
     <w:rPr>
       <w:color w:val="40a070"/>
     </w:rPr>
   </w:style>
-  <w:style w:customStyle="1" w:styleId="ConstantTok" w:type="character">
+  <w:style w:type="character" w:customStyle="1" w:styleId="ConstantTok">
     <w:name w:val="ConstantTok"/>
     <w:basedOn w:val="VerbatimChar"/>
     <w:rPr>
       <w:color w:val="880000"/>
     </w:rPr>
   </w:style>
-  <w:style w:customStyle="1" w:styleId="CharTok" w:type="character">
+  <w:style w:type="character" w:customStyle="1" w:styleId="CharTok">
     <w:name w:val="CharTok"/>
     <w:basedOn w:val="VerbatimChar"/>
     <w:rPr>
       <w:color w:val="4070a0"/>
     </w:rPr>
   </w:style>
-  <w:style w:customStyle="1" w:styleId="SpecialCharTok" w:type="character">
+  <w:style w:type="character" w:customStyle="1" w:styleId="SpecialCharTok">
     <w:name w:val="SpecialCharTok"/>
     <w:basedOn w:val="VerbatimChar"/>
     <w:rPr>
       <w:color w:val="4070a0"/>
     </w:rPr>
   </w:style>
-  <w:style w:customStyle="1" w:styleId="StringTok" w:type="character">
+  <w:style w:type="character" w:customStyle="1" w:styleId="StringTok">
     <w:name w:val="StringTok"/>
     <w:basedOn w:val="VerbatimChar"/>
     <w:rPr>
       <w:color w:val="4070a0"/>
     </w:rPr>
   </w:style>
-  <w:style w:customStyle="1" w:styleId="VerbatimStringTok" w:type="character">
+  <w:style w:type="character" w:customStyle="1" w:styleId="VerbatimStringTok">
     <w:name w:val="VerbatimStringTok"/>
     <w:basedOn w:val="VerbatimChar"/>
     <w:rPr>
       <w:color w:val="4070a0"/>
     </w:rPr>
   </w:style>
-  <w:style w:customStyle="1" w:styleId="SpecialStringTok" w:type="character">
+  <w:style w:type="character" w:customStyle="1" w:styleId="SpecialStringTok">
     <w:name w:val="SpecialStringTok"/>
     <w:basedOn w:val="VerbatimChar"/>
     <w:rPr>
       <w:color w:val="bb6688"/>
     </w:rPr>
   </w:style>
-  <w:style w:customStyle="1" w:styleId="ImportTok" w:type="character">
+  <w:style w:type="character" w:customStyle="1" w:styleId="ImportTok">
     <w:name w:val="ImportTok"/>
     <w:basedOn w:val="VerbatimChar"/>
     <w:rPr>
@@ -1338,7 +1357,7 @@
       <w:b/>
     </w:rPr>
   </w:style>
-  <w:style w:customStyle="1" w:styleId="CommentTok" w:type="character">
+  <w:style w:type="character" w:customStyle="1" w:styleId="CommentTok">
     <w:name w:val="CommentTok"/>
     <w:basedOn w:val="VerbatimChar"/>
     <w:rPr>
@@ -1346,7 +1365,7 @@
       <w:i/>
     </w:rPr>
   </w:style>
-  <w:style w:customStyle="1" w:styleId="DocumentationTok" w:type="character">
+  <w:style w:type="character" w:customStyle="1" w:styleId="DocumentationTok">
     <w:name w:val="DocumentationTok"/>
     <w:basedOn w:val="VerbatimChar"/>
     <w:rPr>
@@ -1354,7 +1373,7 @@
       <w:i/>
     </w:rPr>
   </w:style>
-  <w:style w:customStyle="1" w:styleId="AnnotationTok" w:type="character">
+  <w:style w:type="character" w:customStyle="1" w:styleId="AnnotationTok">
     <w:name w:val="AnnotationTok"/>
     <w:basedOn w:val="VerbatimChar"/>
     <w:rPr>
@@ -1363,7 +1382,7 @@
       <w:i/>
     </w:rPr>
   </w:style>
-  <w:style w:customStyle="1" w:styleId="CommentVarTok" w:type="character">
+  <w:style w:type="character" w:customStyle="1" w:styleId="CommentVarTok">
     <w:name w:val="CommentVarTok"/>
     <w:basedOn w:val="VerbatimChar"/>
     <w:rPr>
@@ -1372,28 +1391,28 @@
       <w:i/>
     </w:rPr>
   </w:style>
-  <w:style w:customStyle="1" w:styleId="OtherTok" w:type="character">
+  <w:style w:type="character" w:customStyle="1" w:styleId="OtherTok">
     <w:name w:val="OtherTok"/>
     <w:basedOn w:val="VerbatimChar"/>
     <w:rPr>
       <w:color w:val="007020"/>
     </w:rPr>
   </w:style>
-  <w:style w:customStyle="1" w:styleId="FunctionTok" w:type="character">
+  <w:style w:type="character" w:customStyle="1" w:styleId="FunctionTok">
     <w:name w:val="FunctionTok"/>
     <w:basedOn w:val="VerbatimChar"/>
     <w:rPr>
       <w:color w:val="06287e"/>
     </w:rPr>
   </w:style>
-  <w:style w:customStyle="1" w:styleId="VariableTok" w:type="character">
+  <w:style w:type="character" w:customStyle="1" w:styleId="VariableTok">
     <w:name w:val="VariableTok"/>
     <w:basedOn w:val="VerbatimChar"/>
     <w:rPr>
       <w:color w:val="19177c"/>
     </w:rPr>
   </w:style>
-  <w:style w:customStyle="1" w:styleId="ControlFlowTok" w:type="character">
+  <w:style w:type="character" w:customStyle="1" w:styleId="ControlFlowTok">
     <w:name w:val="ControlFlowTok"/>
     <w:basedOn w:val="VerbatimChar"/>
     <w:rPr>
@@ -1401,45 +1420,45 @@
       <w:b/>
     </w:rPr>
   </w:style>
-  <w:style w:customStyle="1" w:styleId="OperatorTok" w:type="character">
+  <w:style w:type="character" w:customStyle="1" w:styleId="OperatorTok">
     <w:name w:val="OperatorTok"/>
     <w:basedOn w:val="VerbatimChar"/>
     <w:rPr>
       <w:color w:val="666666"/>
     </w:rPr>
   </w:style>
-  <w:style w:customStyle="1" w:styleId="BuiltInTok" w:type="character">
+  <w:style w:type="character" w:customStyle="1" w:styleId="BuiltInTok">
     <w:name w:val="BuiltInTok"/>
     <w:basedOn w:val="VerbatimChar"/>
     <w:rPr>
       <w:color w:val="008000"/>
     </w:rPr>
   </w:style>
-  <w:style w:customStyle="1" w:styleId="ExtensionTok" w:type="character">
+  <w:style w:type="character" w:customStyle="1" w:styleId="ExtensionTok">
     <w:name w:val="ExtensionTok"/>
     <w:basedOn w:val="VerbatimChar"/>
     <w:rPr/>
   </w:style>
-  <w:style w:customStyle="1" w:styleId="PreprocessorTok" w:type="character">
+  <w:style w:type="character" w:customStyle="1" w:styleId="PreprocessorTok">
     <w:name w:val="PreprocessorTok"/>
     <w:basedOn w:val="VerbatimChar"/>
     <w:rPr>
       <w:color w:val="bc7a00"/>
     </w:rPr>
   </w:style>
-  <w:style w:customStyle="1" w:styleId="AttributeTok" w:type="character">
+  <w:style w:type="character" w:customStyle="1" w:styleId="AttributeTok">
     <w:name w:val="AttributeTok"/>
     <w:basedOn w:val="VerbatimChar"/>
     <w:rPr>
       <w:color w:val="7d9029"/>
     </w:rPr>
   </w:style>
-  <w:style w:customStyle="1" w:styleId="RegionMarkerTok" w:type="character">
+  <w:style w:type="character" w:customStyle="1" w:styleId="RegionMarkerTok">
     <w:name w:val="RegionMarkerTok"/>
     <w:basedOn w:val="VerbatimChar"/>
     <w:rPr/>
   </w:style>
-  <w:style w:customStyle="1" w:styleId="InformationTok" w:type="character">
+  <w:style w:type="character" w:customStyle="1" w:styleId="InformationTok">
     <w:name w:val="InformationTok"/>
     <w:basedOn w:val="VerbatimChar"/>
     <w:rPr>
@@ -1448,7 +1467,7 @@
       <w:i/>
     </w:rPr>
   </w:style>
-  <w:style w:customStyle="1" w:styleId="WarningTok" w:type="character">
+  <w:style w:type="character" w:customStyle="1" w:styleId="WarningTok">
     <w:name w:val="WarningTok"/>
     <w:basedOn w:val="VerbatimChar"/>
     <w:rPr>
@@ -1457,7 +1476,7 @@
       <w:i/>
     </w:rPr>
   </w:style>
-  <w:style w:customStyle="1" w:styleId="AlertTok" w:type="character">
+  <w:style w:type="character" w:customStyle="1" w:styleId="AlertTok">
     <w:name w:val="AlertTok"/>
     <w:basedOn w:val="VerbatimChar"/>
     <w:rPr>
@@ -1465,7 +1484,7 @@
       <w:b/>
     </w:rPr>
   </w:style>
-  <w:style w:customStyle="1" w:styleId="ErrorTok" w:type="character">
+  <w:style w:type="character" w:customStyle="1" w:styleId="ErrorTok">
     <w:name w:val="ErrorTok"/>
     <w:basedOn w:val="VerbatimChar"/>
     <w:rPr>
@@ -1473,7 +1492,7 @@
       <w:b/>
     </w:rPr>
   </w:style>
-  <w:style w:customStyle="1" w:styleId="NormalTok" w:type="character">
+  <w:style w:type="character" w:customStyle="1" w:styleId="NormalTok">
     <w:name w:val="NormalTok"/>
     <w:basedOn w:val="VerbatimChar"/>
     <w:rPr/>

</xml_diff>

<commit_message>
v3.22.0: dark look with blue accent in every window, home stat panels, docs brought up to date
Co-Authored-By: Claude Sonnet 5.5 <noreply@anthropic.com>
Claude-Session: https://claude.ai/code/session_01WkiUyeSJwmrxzEc1reVpsf
</commit_message>
<xml_diff>
--- a/docs/Watchlog - IT Summary.docx
+++ b/docs/Watchlog - IT Summary.docx
@@ -16,7 +16,7 @@
         <w:pStyle w:val="FirstParagraph"/>
       </w:pPr>
       <w:r>
-        <w:t xml:space="preserve">Oct 25, 2026 · Jakob</w:t>
+        <w:t>Oct 30, 2026 · Jakob</w:t>
       </w:r>
     </w:p>
     <w:p>
@@ -39,7 +39,7 @@
         <w:t xml:space="preserve"> </w:t>
       </w:r>
       <w:r>
-        <w:t xml:space="preserve">and the full wording appears. It’s written in AutoHotkey v2 and comes as one Watchlog.exe with the AutoHotkey runtime built in, so nothing else is installed. The same program is also available as one plain text script for anyone to read. I’m on version 3.10.1 and have been using it on my own shifts since October 13. I’m asking for approval so other operators and supervisors can use it if they choose to, on our 3 operator bays and the supervisor bay.</w:t>
+        <w:t>and the full wording appears. It’s written in AutoHotkey v2 and comes as one Watchlog.exe with the AutoHotkey runtime built in, so nothing else is installed. The same program is also available as one plain text script for anyone to read. I’m on version 3.22.0 and have been using it on my own shifts since October 13. I’m asking for approval so other operators and supervisors can use it if they choose to, on our 3 operator bays and the supervisor bay.</w:t>
       </w:r>
     </w:p>
     <w:bookmarkStart w:id="20" w:name="what-it-does-and-doesnt-do"/>
@@ -84,7 +84,7 @@
         <w:pStyle w:val="Compact"/>
       </w:pPr>
       <w:r>
-        <w:t xml:space="preserve">SDS signs the operator out after an hour. Watchlog types the saved SDS login again about 62 minutes after an SDS login the operator did, only if SDS is on its login screen, and then puts the operator’s previous window back. It retries once a minute up to 6 times and can be turned off in Settings &gt; Logins.</w:t>
+        <w:t>For logs that never change (break, table drop, start and end of shift and so on), Ctrl+Alt+F opens a new daily log in iTrak and fills in its fields. It clicks the fields it was taught once per PC and types the wording from templates.txt. The operator still reads the log and saves it. It doesn’t read the screen, and the only thing kept is the screen positions.</w:t>
       </w:r>
     </w:p>
     <w:p>
@@ -96,7 +96,7 @@
         <w:pStyle w:val="Compact"/>
       </w:pPr>
       <w:r>
-        <w:t xml:space="preserve">It doesn’t connect to the internet or send anything anywhere. Its files only travel through OneDrive and SharePoint under our normal Microsoft 365 permissions.</w:t>
+        <w:t xml:space="preserve">SDS signs the operator out after an hour. Watchlog types the saved SDS login again about 62 minutes after an SDS login the operator did, only if SDS is on its login screen, and then puts the operator’s previous window back. It retries once a minute up to 6 times and can be turned off in Settings &gt; Logins.</w:t>
       </w:r>
     </w:p>
     <w:p>
@@ -108,6 +108,18 @@
         <w:pStyle w:val="Compact"/>
       </w:pPr>
       <w:r>
+        <w:t xml:space="preserve">It doesn’t connect to the internet or send anything anywhere. Its files only travel through OneDrive and SharePoint under our normal Microsoft 365 permissions.</w:t>
+      </w:r>
+    </w:p>
+    <w:p>
+      <w:pPr>
+        <w:numPr>
+          <w:ilvl w:val="0"/>
+          <w:numId w:val="1001"/>
+        </w:numPr>
+        <w:pStyle w:val="Compact"/>
+      </w:pPr>
+      <w:r>
         <w:t xml:space="preserve">It doesn’t record what anyone types. It only watches for its own codes. It reads the clipboard only for a form box that takes a copy, and keeps a copied facial rec alert number or match % in memory for 2 minutes at most.</w:t>
       </w:r>
     </w:p>
@@ -287,7 +299,7 @@
         <w:pStyle w:val="Compact"/>
       </w:pPr>
       <w:r>
-        <w:t xml:space="preserve">The automatic SDS sign-back-in (can be off).</w:t>
+        <w:t>Watchlog clicking and typing into the iTrak daily log form (taught positions) for the full daily logs.</w:t>
       </w:r>
     </w:p>
     <w:p>
@@ -299,7 +311,7 @@
         <w:pStyle w:val="Compact"/>
       </w:pPr>
       <w:r>
-        <w:t xml:space="preserve">The 30 day shift journal (or counts only).</w:t>
+        <w:t xml:space="preserve">The automatic SDS sign-back-in (can be off).</w:t>
       </w:r>
     </w:p>
     <w:p>
@@ -311,6 +323,18 @@
         <w:pStyle w:val="Compact"/>
       </w:pPr>
       <w:r>
+        <w:t xml:space="preserve">The 30 day shift journal (or counts only).</w:t>
+      </w:r>
+    </w:p>
+    <w:p>
+      <w:pPr>
+        <w:numPr>
+          <w:ilvl w:val="0"/>
+          <w:numId w:val="1003"/>
+        </w:numPr>
+        <w:pStyle w:val="Compact"/>
+      </w:pPr>
+      <w:r>
         <w:t xml:space="preserve">Edit access to the SharePoint template folder.</w:t>
       </w:r>
     </w:p>
@@ -341,7 +365,7 @@
         <w:t xml:space="preserve">%LOCALAPPDATA%\Programs\Watchlog</w:t>
       </w:r>
       <w:r>
-        <w:t xml:space="preserve">, with a Start menu entry and a Startup shortcut), go through the welcome window, then teach the Alert Grid clicks once with Ctrl+Alt+Shift+A. Settings live in</w:t>
+        <w:t>, with a Start menu entry and a Startup shortcut), go through the welcome window, then teach the Alert Grid clicks once with Ctrl+Alt+Shift+A and the iTrak clicks with Ctrl+Alt+Shift+I and Ctrl+Alt+Shift+F. Settings live in</w:t>
       </w:r>
       <w:r>
         <w:t xml:space="preserve"> </w:t>

</xml_diff>

<commit_message>
Bring all docs to v3.23.0 and rebuild the Word/PDF docs
Co-Authored-By: Claude Sonnet 5.5 <noreply@anthropic.com>
Claude-Session: https://claude.ai/code/session_01WkiUyeK86nsY8rf2DFQKiA
</commit_message>
<xml_diff>
--- a/docs/Watchlog - IT Summary.docx
+++ b/docs/Watchlog - IT Summary.docx
@@ -16,7 +16,7 @@
         <w:pStyle w:val="FirstParagraph"/>
       </w:pPr>
       <w:r>
-        <w:t>Oct 30, 2026 · Jakob</w:t>
+        <w:t xml:space="preserve">Oct 25, 2026 · Jakob</w:t>
       </w:r>
     </w:p>
     <w:p>
@@ -39,7 +39,7 @@
         <w:t xml:space="preserve"> </w:t>
       </w:r>
       <w:r>
-        <w:t>and the full wording appears. It’s written in AutoHotkey v2 and comes as one Watchlog.exe with the AutoHotkey runtime built in, so nothing else is installed. The same program is also available as one plain text script for anyone to read. I’m on version 3.22.2 and have been using it on my own shifts since October 13. I’m asking for approval so other operators and supervisors can use it if they choose to, on our 3 operator bays and the supervisor bay.</w:t>
+        <w:t xml:space="preserve">and the full wording appears. It’s written in AutoHotkey v2 and comes as one Watchlog.exe with the AutoHotkey runtime built in, so nothing else is installed. The same program is also available as one plain text script for anyone to read. I’m on version 3.23.0 and have been using it on my own shifts since October 13. I’m asking for approval so other operators and supervisors can use it if they choose to, on our 3 operator bays and the supervisor bay.</w:t>
       </w:r>
     </w:p>
     <w:bookmarkStart w:id="20" w:name="what-it-does-and-doesnt-do"/>
@@ -84,7 +84,7 @@
         <w:pStyle w:val="Compact"/>
       </w:pPr>
       <w:r>
-        <w:t>For logs that never change (break, table drop, start and end of shift and so on), Ctrl+Alt+F opens a new daily log in iTrak and fills in its fields. It clicks the fields it was taught once per PC and types the wording from templates.txt. The operator still reads the log and saves it. It doesn’t read the screen, and the only thing kept is the screen positions.</w:t>
+        <w:t xml:space="preserve">SDS signs the operator out after an hour. Watchlog types the saved SDS login again about 62 minutes after an SDS login the operator did, only if SDS is on its login screen, and then puts the operator’s previous window back. It retries once a minute up to 6 times and can be turned off in Settings &gt; Logins.</w:t>
       </w:r>
     </w:p>
     <w:p>
@@ -96,7 +96,7 @@
         <w:pStyle w:val="Compact"/>
       </w:pPr>
       <w:r>
-        <w:t xml:space="preserve">SDS signs the operator out after an hour. Watchlog types the saved SDS login again about 62 minutes after an SDS login the operator did, only if SDS is on its login screen, and then puts the operator’s previous window back. It retries once a minute up to 6 times and can be turned off in Settings &gt; Logins.</w:t>
+        <w:t xml:space="preserve">It doesn’t connect to the internet or send anything anywhere. Its files only travel through OneDrive and SharePoint under our normal Microsoft 365 permissions.</w:t>
       </w:r>
     </w:p>
     <w:p>
@@ -108,18 +108,6 @@
         <w:pStyle w:val="Compact"/>
       </w:pPr>
       <w:r>
-        <w:t xml:space="preserve">It doesn’t connect to the internet or send anything anywhere. Its files only travel through OneDrive and SharePoint under our normal Microsoft 365 permissions.</w:t>
-      </w:r>
-    </w:p>
-    <w:p>
-      <w:pPr>
-        <w:numPr>
-          <w:ilvl w:val="0"/>
-          <w:numId w:val="1001"/>
-        </w:numPr>
-        <w:pStyle w:val="Compact"/>
-      </w:pPr>
-      <w:r>
         <w:t xml:space="preserve">It doesn’t record what anyone types. It only watches for its own codes. It reads the clipboard only for a form box that takes a copy, and keeps a copied facial rec alert number or match % in memory for 2 minutes at most.</w:t>
       </w:r>
     </w:p>
@@ -299,7 +287,7 @@
         <w:pStyle w:val="Compact"/>
       </w:pPr>
       <w:r>
-        <w:t>Watchlog clicking and typing into the iTrak daily log form (taught positions) for the full daily logs.</w:t>
+        <w:t xml:space="preserve">The automatic SDS sign-back-in (can be off).</w:t>
       </w:r>
     </w:p>
     <w:p>
@@ -311,7 +299,7 @@
         <w:pStyle w:val="Compact"/>
       </w:pPr>
       <w:r>
-        <w:t xml:space="preserve">The automatic SDS sign-back-in (can be off).</w:t>
+        <w:t xml:space="preserve">The 30 day shift journal (or counts only).</w:t>
       </w:r>
     </w:p>
     <w:p>
@@ -323,18 +311,6 @@
         <w:pStyle w:val="Compact"/>
       </w:pPr>
       <w:r>
-        <w:t xml:space="preserve">The 30 day shift journal (or counts only).</w:t>
-      </w:r>
-    </w:p>
-    <w:p>
-      <w:pPr>
-        <w:numPr>
-          <w:ilvl w:val="0"/>
-          <w:numId w:val="1003"/>
-        </w:numPr>
-        <w:pStyle w:val="Compact"/>
-      </w:pPr>
-      <w:r>
         <w:t xml:space="preserve">Edit access to the SharePoint template folder.</w:t>
       </w:r>
     </w:p>
@@ -365,7 +341,7 @@
         <w:t xml:space="preserve">%LOCALAPPDATA%\Programs\Watchlog</w:t>
       </w:r>
       <w:r>
-        <w:t>, with a Start menu entry and a Startup shortcut), go through the welcome window, then teach the Alert Grid clicks once with Ctrl+Alt+Shift+A and the iTrak clicks with Ctrl+Alt+Shift+I and Ctrl+Alt+Shift+F. Settings live in</w:t>
+        <w:t xml:space="preserve">, with a Start menu entry and a Startup shortcut), go through the welcome window, then teach the Alert Grid clicks once with Ctrl+Alt+Shift+A. Settings live in</w:t>
       </w:r>
       <w:r>
         <w:t xml:space="preserve"> </w:t>

</xml_diff>

<commit_message>
v3.29.1: code and docs review
- LoadTemplates declares global Entries; app keys can't take Ctrl+Alt+D/F
- README: history version tags restored, section 19 for newer features,
  settings.ini reference completed, tray menu list updated
- Overview, IT Summary, Summary describe current behaviour
- tools/bump-version.py, tools/check-ahk.py, build/release.sh

Co-Authored-By: Claude Opus 5.5 <noreply@anthropic.com>
Claude-Session: https://claude.ai/code/session_01WkiUyhHHodp8YwtfXPPPBP
</commit_message>
<xml_diff>
--- a/docs/Watchlog - IT Summary.docx
+++ b/docs/Watchlog - IT Summary.docx
@@ -16,7 +16,7 @@
         <w:pStyle w:val="FirstParagraph"/>
       </w:pPr>
       <w:r>
-        <w:t xml:space="preserve">Oct 25, 2026 · Jakob</w:t>
+        <w:t xml:space="preserve">Oct 31, 2026 · Jakob</w:t>
       </w:r>
     </w:p>
     <w:p>
@@ -39,7 +39,7 @@
         <w:t xml:space="preserve"> </w:t>
       </w:r>
       <w:r>
-        <w:t xml:space="preserve">and the full wording appears. It’s written in AutoHotkey v2 and comes as one Watchlog.exe with the AutoHotkey runtime built in, so nothing else is installed. The same program is also available as one plain text script for anyone to read. I’m on version 3.29.0 and have been using it on my own shifts since October 13. I’m asking for approval so other operators and supervisors can use it if they choose to, on our 3 operator bays and the supervisor bay.</w:t>
+        <w:t xml:space="preserve">and the full wording appears. It’s written in AutoHotkey v2 and comes as one Watchlog.exe with the AutoHotkey runtime built in, so nothing else is installed. The same program is also available as one plain text script for anyone to read. I’m on version 3.29.1 and have been using it on my own shifts since October 13. I’m asking for approval so other operators and supervisors can use it if they choose to, on our 3 operator bays and the supervisor bay.</w:t>
       </w:r>
     </w:p>
     <w:bookmarkStart w:id="20" w:name="what-it-does-and-doesnt-do"/>
@@ -84,7 +84,7 @@
         <w:pStyle w:val="Compact"/>
       </w:pPr>
       <w:r>
-        <w:t xml:space="preserve">SDS signs the operator out after an hour. Watchlog types the saved SDS login again about 62 minutes after an SDS login the operator did, only if SDS is on its login screen, and then puts the operator’s previous window back. It retries once a minute up to 6 times and can be turned off in Settings &gt; Logins.</w:t>
+        <w:t xml:space="preserve">It can open a new iTrak daily log and fill in Location, Topic, Reference and Synopsis by clicking spots taught once per PC. It never clicks Save: the operator reads the entry and saves it.</w:t>
       </w:r>
     </w:p>
     <w:p>
@@ -96,7 +96,7 @@
         <w:pStyle w:val="Compact"/>
       </w:pPr>
       <w:r>
-        <w:t xml:space="preserve">It doesn’t connect to the internet or send anything anywhere. Its files only travel through OneDrive and SharePoint under our normal Microsoft 365 permissions.</w:t>
+        <w:t xml:space="preserve">SDS signs the operator out after an hour. Watchlog types the saved SDS login again about 62 minutes after an SDS login the operator did, only if SDS is on its login screen, and then puts the operator’s previous window back. It retries once a minute up to 6 times and can be turned off in Settings &gt; Logins.</w:t>
       </w:r>
     </w:p>
     <w:p>
@@ -108,6 +108,18 @@
         <w:pStyle w:val="Compact"/>
       </w:pPr>
       <w:r>
+        <w:t xml:space="preserve">It doesn’t connect to the internet or send anything anywhere. Its files only travel through OneDrive and SharePoint under our normal Microsoft 365 permissions.</w:t>
+      </w:r>
+    </w:p>
+    <w:p>
+      <w:pPr>
+        <w:numPr>
+          <w:ilvl w:val="0"/>
+          <w:numId w:val="1001"/>
+        </w:numPr>
+        <w:pStyle w:val="Compact"/>
+      </w:pPr>
+      <w:r>
         <w:t xml:space="preserve">It doesn’t record what anyone types. It only watches for its own codes. It reads the clipboard only for a form box that takes a copy, and keeps a copied facial rec alert number or match % in memory for 2 minutes at most.</w:t>
       </w:r>
     </w:p>
@@ -184,7 +196,22 @@
         <w:pStyle w:val="Compact"/>
       </w:pPr>
       <w:r>
-        <w:t xml:space="preserve">On the PC only: the activity log (never passwords or log text), Alert Grid click positions, window positions, time saved counts and a few last-used box values. The registry holds the last login time and the uninstall entry.</w:t>
+        <w:t xml:space="preserve">On the PC only: the activity log (never passwords or log text), Alert Grid and iTrak click positions, window positions, time saved counts, break minutes used this shift and a few last-used box values. Once a day it backs up the operator’s templates, settings and click positions (never passwords) to</w:t>
+      </w:r>
+      <w:r>
+        <w:t xml:space="preserve"> </w:t>
+      </w:r>
+      <w:r>
+        <w:rPr>
+          <w:rStyle w:val="VerbatimChar"/>
+        </w:rPr>
+        <w:t xml:space="preserve">%LOCALAPPDATA%\Watchlog\Backups</w:t>
+      </w:r>
+      <w:r>
+        <w:t xml:space="preserve"> </w:t>
+      </w:r>
+      <w:r>
+        <w:t xml:space="preserve">and keeps 14 days. The registry holds the last login time and the uninstall entry.</w:t>
       </w:r>
     </w:p>
     <w:p>
@@ -229,7 +256,7 @@
         <w:t xml:space="preserve">”</w:t>
       </w:r>
       <w:r>
-        <w:t xml:space="preserve">, checks the file, keeps a backup and refuses a broken one. That means whoever can edit the folder controls what the bays run, so I’d ask that edit access be limited to the supervisors and me. A user can also point their own PC at a folder of their own for testing, which only affects that PC.</w:t>
+        <w:t xml:space="preserve">, checks the file, keeps a backup and refuses a broken one. The tray menu can put the previous version back. That means whoever can edit the folder controls what the bays run, so I’d ask that edit access be limited to the supervisors and me. A user can also point their own PC at a folder of their own for testing, which only affects that PC.</w:t>
       </w:r>
     </w:p>
     <w:bookmarkEnd w:id="22"/>
@@ -275,7 +302,7 @@
         <w:pStyle w:val="Compact"/>
       </w:pPr>
       <w:r>
-        <w:t xml:space="preserve">Watchlog clicking through the Alert Grid acknowledge steps for the operator.</w:t>
+        <w:t xml:space="preserve">Watchlog clicking through the Alert Grid acknowledge steps, and opening and filling in a new iTrak daily log, for the operator.</w:t>
       </w:r>
     </w:p>
     <w:p>
@@ -341,7 +368,7 @@
         <w:t xml:space="preserve">%LOCALAPPDATA%\Programs\Watchlog</w:t>
       </w:r>
       <w:r>
-        <w:t xml:space="preserve">, with a Start menu entry and a Startup shortcut), go through the welcome window, then teach the Alert Grid clicks once with Ctrl+Alt+Shift+A. Settings live in</w:t>
+        <w:t xml:space="preserve">, with a Start menu entry and a Startup shortcut), go through the welcome window, then teach the Alert Grid clicks once with Ctrl+Alt+Shift+A and the iTrak daily log spots with Ctrl+Alt+Shift+I and Ctrl+Alt+Shift+F. Settings live in</w:t>
       </w:r>
       <w:r>
         <w:t xml:space="preserve"> </w:t>

</xml_diff>

<commit_message>
v3.30.0: Info From people search after a code word fills the daily log
Co-Authored-By: Claude Opus 5.5 <noreply@anthropic.com>
Claude-Session: https://claude.ai/code/session_01WkiUyhHHodp8YwtfXPPPBP
</commit_message>
<xml_diff>
--- a/docs/Watchlog - IT Summary.docx
+++ b/docs/Watchlog - IT Summary.docx
@@ -39,7 +39,7 @@
         <w:t xml:space="preserve"> </w:t>
       </w:r>
       <w:r>
-        <w:t xml:space="preserve">and the full wording appears. It’s written in AutoHotkey v2 and comes as one Watchlog.exe with the AutoHotkey runtime built in, so nothing else is installed. The same program is also available as one plain text script for anyone to read. I’m on version 3.29.2 and have been using it on my own shifts since October 13. I’m asking for approval so other operators and supervisors can use it if they choose to, on our 3 operator bays and the supervisor bay.</w:t>
+        <w:t xml:space="preserve">and the full wording appears. It’s written in AutoHotkey v2 and comes as one Watchlog.exe with the AutoHotkey runtime built in, so nothing else is installed. The same program is also available as one plain text script for anyone to read. I’m on version 3.30.0 and have been using it on my own shifts since October 13. I’m asking for approval so other operators and supervisors can use it if they choose to, on our 3 operator bays and the supervisor bay.</w:t>
       </w:r>
     </w:p>
     <w:bookmarkStart w:id="20" w:name="what-it-does-and-doesnt-do"/>
@@ -84,7 +84,7 @@
         <w:pStyle w:val="Compact"/>
       </w:pPr>
       <w:r>
-        <w:t xml:space="preserve">It can open a new iTrak daily log and fill in Location, Topic, Reference and Synopsis by clicking spots taught once per PC. It never clicks Save: the operator reads the entry and saves it.</w:t>
+        <w:t xml:space="preserve">It can open a new iTrak daily log and fill in Location, Topic, Reference and Synopsis by clicking spots taught once per PC, then search Info From &gt; Personnel by department so the operator can pick the person. It never clicks Save: the operator reads the entry and saves it.</w:t>
       </w:r>
     </w:p>
     <w:p>

</xml_diff>